<commit_message>
docs(video): guion, storyboard y ensayo a 5x60 s mudos y 300 s
- Reparto B1-B5 a 60 s cada uno (0:00-5:00, 300 s) con cues por clip
  tomados del plan de produccion 60 s.
- Copy alineado con 9d5b831: Registrar solicitud, casilla de registro,
  "No se notifico al equipo comercial." y cierre "Prototipo funcional".
- Videos sin voz ni musica; locucion humana en vivo o grabada por
  Persona1-Persona5. B1 86 y B5 78 palabras (total 401).
- Guion de presentacion.docx regenerado solo desde el Markdown.

Co-Authored-By: Claude Opus 5.5 <noreply@anthropic.com>
</commit_message>
<xml_diff>
--- a/entregables/Guion de presentacion.docx
+++ b/entregables/Guion de presentacion.docx
@@ -38,23 +38,147 @@
           <w:sz w:val="22"/>
           <w:szCs w:val="22"/>
         </w:rPr>
-        <w:t xml:space="preserve"> integración del diseño definitivo </w:t>
-      </w:r>
-      <w:r>
-        <w:rPr>
-          <w:rFonts w:ascii="Calibri" w:hAnsi="Calibri" w:eastAsia="Calibri" w:cs="Calibri"/>
-          <w:sz w:val="22"/>
-          <w:szCs w:val="22"/>
-        </w:rPr>
-        <w:t>`diseno-video-5min.md` (diseno-video-5min.md)</w:t>
-      </w:r>
-      <w:r>
-        <w:rPr>
-          <w:rFonts w:ascii="Calibri" w:hAnsi="Calibri" w:eastAsia="Calibri" w:cs="Calibri"/>
-          <w:sz w:val="22"/>
-          <w:szCs w:val="22"/>
-        </w:rPr>
-        <w:t xml:space="preserve"> con el cierre de QA registrado el 2026-10-30 UTC. Las locuciones B1–B3 se conservan; B4–B5 tienen ajustes mínimos explicados en el storyboard. </w:t>
+        <w:t xml:space="preserve"> alineada con el </w:t>
+      </w:r>
+      <w:r>
+        <w:rPr>
+          <w:rFonts w:ascii="Calibri" w:hAnsi="Calibri" w:eastAsia="Calibri" w:cs="Calibri"/>
+          <w:sz w:val="22"/>
+          <w:szCs w:val="22"/>
+        </w:rPr>
+        <w:t>plan de producción de 5 clips de 60 s (plan-produccion-video-60s.md)</w:t>
+      </w:r>
+      <w:r>
+        <w:rPr>
+          <w:rFonts w:ascii="Calibri" w:hAnsi="Calibri" w:eastAsia="Calibri" w:cs="Calibri"/>
+          <w:sz w:val="22"/>
+          <w:szCs w:val="22"/>
+        </w:rPr>
+        <w:t xml:space="preserve"> y con la UI del commit </w:t>
+      </w:r>
+      <w:r>
+        <w:rPr>
+          <w:rFonts w:ascii="Calibri" w:hAnsi="Calibri" w:eastAsia="Calibri" w:cs="Calibri"/>
+          <w:sz w:val="22"/>
+          <w:szCs w:val="22"/>
+        </w:rPr>
+        <w:t>9d5b831</w:t>
+      </w:r>
+      <w:r>
+        <w:rPr>
+          <w:rFonts w:ascii="Calibri" w:hAnsi="Calibri" w:eastAsia="Calibri" w:cs="Calibri"/>
+          <w:sz w:val="22"/>
+          <w:szCs w:val="22"/>
+        </w:rPr>
+        <w:t xml:space="preserve">. </w:t>
+      </w:r>
+      <w:r>
+        <w:rPr>
+          <w:rFonts w:ascii="Calibri" w:hAnsi="Calibri" w:eastAsia="Calibri" w:cs="Calibri"/>
+          <w:sz w:val="22"/>
+          <w:szCs w:val="22"/>
+          <w:b/>
+          <w:bCs/>
+        </w:rPr>
+        <w:t>Formato:</w:t>
+      </w:r>
+      <w:r>
+        <w:rPr>
+          <w:rFonts w:ascii="Calibri" w:hAnsi="Calibri" w:eastAsia="Calibri" w:cs="Calibri"/>
+          <w:sz w:val="22"/>
+          <w:szCs w:val="22"/>
+        </w:rPr>
+        <w:t xml:space="preserve"> cinco clips autónomos de </w:t>
+      </w:r>
+      <w:r>
+        <w:rPr>
+          <w:rFonts w:ascii="Calibri" w:hAnsi="Calibri" w:eastAsia="Calibri" w:cs="Calibri"/>
+          <w:sz w:val="22"/>
+          <w:szCs w:val="22"/>
+          <w:b/>
+          <w:bCs/>
+        </w:rPr>
+        <w:t>60 s</w:t>
+      </w:r>
+      <w:r>
+        <w:rPr>
+          <w:rFonts w:ascii="Calibri" w:hAnsi="Calibri" w:eastAsia="Calibri" w:cs="Calibri"/>
+          <w:sz w:val="22"/>
+          <w:szCs w:val="22"/>
+        </w:rPr>
+        <w:t xml:space="preserve"> cada uno y una versión continua de </w:t>
+      </w:r>
+      <w:r>
+        <w:rPr>
+          <w:rFonts w:ascii="Calibri" w:hAnsi="Calibri" w:eastAsia="Calibri" w:cs="Calibri"/>
+          <w:sz w:val="22"/>
+          <w:szCs w:val="22"/>
+          <w:b/>
+          <w:bCs/>
+        </w:rPr>
+        <w:t>300 s</w:t>
+      </w:r>
+      <w:r>
+        <w:rPr>
+          <w:rFonts w:ascii="Calibri" w:hAnsi="Calibri" w:eastAsia="Calibri" w:cs="Calibri"/>
+          <w:sz w:val="22"/>
+          <w:szCs w:val="22"/>
+        </w:rPr>
+        <w:t xml:space="preserve"> (5:00). Los videos son </w:t>
+      </w:r>
+      <w:r>
+        <w:rPr>
+          <w:rFonts w:ascii="Calibri" w:hAnsi="Calibri" w:eastAsia="Calibri" w:cs="Calibri"/>
+          <w:sz w:val="22"/>
+          <w:szCs w:val="22"/>
+          <w:b/>
+          <w:bCs/>
+        </w:rPr>
+        <w:t>mudos</w:t>
+      </w:r>
+      <w:r>
+        <w:rPr>
+          <w:rFonts w:ascii="Calibri" w:hAnsi="Calibri" w:eastAsia="Calibri" w:cs="Calibri"/>
+          <w:sz w:val="22"/>
+          <w:szCs w:val="22"/>
+        </w:rPr>
+        <w:t xml:space="preserve">: no llevan voz, música ni pista de audio. La locución la hacen las cinco personas, </w:t>
+      </w:r>
+      <w:r>
+        <w:rPr>
+          <w:rFonts w:ascii="Calibri" w:hAnsi="Calibri" w:eastAsia="Calibri" w:cs="Calibri"/>
+          <w:sz w:val="22"/>
+          <w:szCs w:val="22"/>
+          <w:b/>
+          <w:bCs/>
+        </w:rPr>
+        <w:t>en vivo</w:t>
+      </w:r>
+      <w:r>
+        <w:rPr>
+          <w:rFonts w:ascii="Calibri" w:hAnsi="Calibri" w:eastAsia="Calibri" w:cs="Calibri"/>
+          <w:sz w:val="22"/>
+          <w:szCs w:val="22"/>
+        </w:rPr>
+        <w:t xml:space="preserve"> durante la proyección o </w:t>
+      </w:r>
+      <w:r>
+        <w:rPr>
+          <w:rFonts w:ascii="Calibri" w:hAnsi="Calibri" w:eastAsia="Calibri" w:cs="Calibri"/>
+          <w:sz w:val="22"/>
+          <w:szCs w:val="22"/>
+          <w:b/>
+          <w:bCs/>
+        </w:rPr>
+        <w:t>grabada</w:t>
+      </w:r>
+      <w:r>
+        <w:rPr>
+          <w:rFonts w:ascii="Calibri" w:hAnsi="Calibri" w:eastAsia="Calibri" w:cs="Calibri"/>
+          <w:sz w:val="22"/>
+          <w:szCs w:val="22"/>
+        </w:rPr>
+        <w:t xml:space="preserve"> por cada una sobre su clip. </w:t>
       </w:r>
       <w:r>
         <w:rPr>
@@ -72,7 +196,7 @@
           <w:sz w:val="22"/>
           <w:szCs w:val="22"/>
         </w:rPr>
-        <w:t xml:space="preserve"> texto para cinco clips independientes; todavía no es una lectura humana ensayada ni un video grabado. Las duraciones son presupuestos, no mediciones.</w:t>
+        <w:t xml:space="preserve"> todavía no hay MP4, lectura humana ensayada ni locución grabada; las duraciones de voz son estimaciones, no mediciones.</w:t>
       </w:r>
     </w:p>
     <w:p>
@@ -111,10 +235,11 @@
         </w:tblCellMar>
       </w:tblPr>
       <w:tblGrid>
-        <w:gridCol w:w="1424"/>
-        <w:gridCol w:w="1424"/>
-        <w:gridCol w:w="4140"/>
-        <w:gridCol w:w="1516"/>
+        <w:gridCol w:w="1226"/>
+        <w:gridCol w:w="1226"/>
+        <w:gridCol w:w="3531"/>
+        <w:gridCol w:w="1292"/>
+        <w:gridCol w:w="1229"/>
       </w:tblGrid>
       <w:tr>
         <w:trPr>
@@ -122,7 +247,7 @@
         </w:trPr>
         <w:tc>
           <w:tcPr>
-            <w:tcW w:w="1424" w:type="dxa"/>
+            <w:tcW w:w="1226" w:type="dxa"/>
             <w:shd w:val="clear" w:fill="EAF0F6"/>
             <w:vAlign w:val="top"/>
           </w:tcPr>
@@ -144,7 +269,7 @@
         </w:tc>
         <w:tc>
           <w:tcPr>
-            <w:tcW w:w="1424" w:type="dxa"/>
+            <w:tcW w:w="1226" w:type="dxa"/>
             <w:shd w:val="clear" w:fill="EAF0F6"/>
             <w:vAlign w:val="top"/>
           </w:tcPr>
@@ -166,7 +291,7 @@
         </w:tc>
         <w:tc>
           <w:tcPr>
-            <w:tcW w:w="4140" w:type="dxa"/>
+            <w:tcW w:w="3531" w:type="dxa"/>
             <w:shd w:val="clear" w:fill="EAF0F6"/>
             <w:vAlign w:val="top"/>
           </w:tcPr>
@@ -188,7 +313,7 @@
         </w:tc>
         <w:tc>
           <w:tcPr>
-            <w:tcW w:w="1516" w:type="dxa"/>
+            <w:tcW w:w="1292" w:type="dxa"/>
             <w:shd w:val="clear" w:fill="EAF0F6"/>
             <w:vAlign w:val="top"/>
           </w:tcPr>
@@ -204,7 +329,29 @@
                 <w:b/>
                 <w:bCs/>
               </w:rPr>
-              <w:t>Ventana del montaje</w:t>
+              <w:t>Ventana en el continuo</w:t>
+            </w:r>
+          </w:p>
+        </w:tc>
+        <w:tc>
+          <w:tcPr>
+            <w:tcW w:w="1229" w:type="dxa"/>
+            <w:shd w:val="clear" w:fill="EAF0F6"/>
+            <w:vAlign w:val="top"/>
+          </w:tcPr>
+          <w:p>
+            <w:pPr>
+              <w:spacing w:before="0" w:after="30" w:line="230" w:lineRule="auto"/>
+            </w:pPr>
+            <w:r>
+              <w:rPr>
+                <w:rFonts w:ascii="Calibri" w:hAnsi="Calibri" w:eastAsia="Calibri" w:cs="Calibri"/>
+                <w:sz w:val="18"/>
+                <w:szCs w:val="18"/>
+                <w:b/>
+                <w:bCs/>
+              </w:rPr>
+              <w:t>Duración</w:t>
             </w:r>
           </w:p>
         </w:tc>
@@ -212,7 +359,7 @@
       <w:tr>
         <w:tc>
           <w:tcPr>
-            <w:tcW w:w="1424" w:type="dxa"/>
+            <w:tcW w:w="1226" w:type="dxa"/>
             <w:vAlign w:val="top"/>
           </w:tcPr>
           <w:p>
@@ -231,7 +378,7 @@
         </w:tc>
         <w:tc>
           <w:tcPr>
-            <w:tcW w:w="1424" w:type="dxa"/>
+            <w:tcW w:w="1226" w:type="dxa"/>
             <w:vAlign w:val="top"/>
           </w:tcPr>
           <w:p>
@@ -250,39 +397,58 @@
         </w:tc>
         <w:tc>
           <w:tcPr>
-            <w:tcW w:w="4140" w:type="dxa"/>
-            <w:vAlign w:val="top"/>
-          </w:tcPr>
-          <w:p>
-            <w:pPr>
-              <w:spacing w:before="0" w:after="30" w:line="230" w:lineRule="auto"/>
-            </w:pPr>
-            <w:r>
-              <w:rPr>
-                <w:rFonts w:ascii="Calibri" w:hAnsi="Calibri" w:eastAsia="Calibri" w:cs="Calibri"/>
-                <w:sz w:val="18"/>
-                <w:szCs w:val="18"/>
-              </w:rPr>
-              <w:t>Cliente configura y envía la solicitud</w:t>
-            </w:r>
-          </w:p>
-        </w:tc>
-        <w:tc>
-          <w:tcPr>
-            <w:tcW w:w="1516" w:type="dxa"/>
-            <w:vAlign w:val="top"/>
-          </w:tcPr>
-          <w:p>
-            <w:pPr>
-              <w:spacing w:before="0" w:after="30" w:line="230" w:lineRule="auto"/>
-            </w:pPr>
-            <w:r>
-              <w:rPr>
-                <w:rFonts w:ascii="Calibri" w:hAnsi="Calibri" w:eastAsia="Calibri" w:cs="Calibri"/>
-                <w:sz w:val="18"/>
-                <w:szCs w:val="18"/>
-              </w:rPr>
-              <w:t>0:00–0:58</w:t>
+            <w:tcW w:w="3531" w:type="dxa"/>
+            <w:vAlign w:val="top"/>
+          </w:tcPr>
+          <w:p>
+            <w:pPr>
+              <w:spacing w:before="0" w:after="30" w:line="230" w:lineRule="auto"/>
+            </w:pPr>
+            <w:r>
+              <w:rPr>
+                <w:rFonts w:ascii="Calibri" w:hAnsi="Calibri" w:eastAsia="Calibri" w:cs="Calibri"/>
+                <w:sz w:val="18"/>
+                <w:szCs w:val="18"/>
+              </w:rPr>
+              <w:t>Cliente Alfa configura y registra la solicitud</w:t>
+            </w:r>
+          </w:p>
+        </w:tc>
+        <w:tc>
+          <w:tcPr>
+            <w:tcW w:w="1292" w:type="dxa"/>
+            <w:vAlign w:val="top"/>
+          </w:tcPr>
+          <w:p>
+            <w:pPr>
+              <w:spacing w:before="0" w:after="30" w:line="230" w:lineRule="auto"/>
+            </w:pPr>
+            <w:r>
+              <w:rPr>
+                <w:rFonts w:ascii="Calibri" w:hAnsi="Calibri" w:eastAsia="Calibri" w:cs="Calibri"/>
+                <w:sz w:val="18"/>
+                <w:szCs w:val="18"/>
+              </w:rPr>
+              <w:t>0:00–1:00</w:t>
+            </w:r>
+          </w:p>
+        </w:tc>
+        <w:tc>
+          <w:tcPr>
+            <w:tcW w:w="1229" w:type="dxa"/>
+            <w:vAlign w:val="top"/>
+          </w:tcPr>
+          <w:p>
+            <w:pPr>
+              <w:spacing w:before="0" w:after="30" w:line="230" w:lineRule="auto"/>
+            </w:pPr>
+            <w:r>
+              <w:rPr>
+                <w:rFonts w:ascii="Calibri" w:hAnsi="Calibri" w:eastAsia="Calibri" w:cs="Calibri"/>
+                <w:sz w:val="18"/>
+                <w:szCs w:val="18"/>
+              </w:rPr>
+              <w:t>60 s</w:t>
             </w:r>
           </w:p>
         </w:tc>
@@ -290,7 +456,7 @@
       <w:tr>
         <w:tc>
           <w:tcPr>
-            <w:tcW w:w="1424" w:type="dxa"/>
+            <w:tcW w:w="1226" w:type="dxa"/>
             <w:vAlign w:val="top"/>
           </w:tcPr>
           <w:p>
@@ -309,7 +475,7 @@
         </w:tc>
         <w:tc>
           <w:tcPr>
-            <w:tcW w:w="1424" w:type="dxa"/>
+            <w:tcW w:w="1226" w:type="dxa"/>
             <w:vAlign w:val="top"/>
           </w:tcPr>
           <w:p>
@@ -328,39 +494,58 @@
         </w:tc>
         <w:tc>
           <w:tcPr>
-            <w:tcW w:w="4140" w:type="dxa"/>
-            <w:vAlign w:val="top"/>
-          </w:tcPr>
-          <w:p>
-            <w:pPr>
-              <w:spacing w:before="0" w:after="30" w:line="230" w:lineRule="auto"/>
-            </w:pPr>
-            <w:r>
-              <w:rPr>
-                <w:rFonts w:ascii="Calibri" w:hAnsi="Calibri" w:eastAsia="Calibri" w:cs="Calibri"/>
-                <w:sz w:val="18"/>
-                <w:szCs w:val="18"/>
-              </w:rPr>
-              <w:t>Comercial convierte cotización en pedido</w:t>
-            </w:r>
-          </w:p>
-        </w:tc>
-        <w:tc>
-          <w:tcPr>
-            <w:tcW w:w="1516" w:type="dxa"/>
-            <w:vAlign w:val="top"/>
-          </w:tcPr>
-          <w:p>
-            <w:pPr>
-              <w:spacing w:before="0" w:after="30" w:line="230" w:lineRule="auto"/>
-            </w:pPr>
-            <w:r>
-              <w:rPr>
-                <w:rFonts w:ascii="Calibri" w:hAnsi="Calibri" w:eastAsia="Calibri" w:cs="Calibri"/>
-                <w:sz w:val="18"/>
-                <w:szCs w:val="18"/>
-              </w:rPr>
-              <w:t>0:58–1:56</w:t>
+            <w:tcW w:w="3531" w:type="dxa"/>
+            <w:vAlign w:val="top"/>
+          </w:tcPr>
+          <w:p>
+            <w:pPr>
+              <w:spacing w:before="0" w:after="30" w:line="230" w:lineRule="auto"/>
+            </w:pPr>
+            <w:r>
+              <w:rPr>
+                <w:rFonts w:ascii="Calibri" w:hAnsi="Calibri" w:eastAsia="Calibri" w:cs="Calibri"/>
+                <w:sz w:val="18"/>
+                <w:szCs w:val="18"/>
+              </w:rPr>
+              <w:t>Comercial convierte la cotización en pedido</w:t>
+            </w:r>
+          </w:p>
+        </w:tc>
+        <w:tc>
+          <w:tcPr>
+            <w:tcW w:w="1292" w:type="dxa"/>
+            <w:vAlign w:val="top"/>
+          </w:tcPr>
+          <w:p>
+            <w:pPr>
+              <w:spacing w:before="0" w:after="30" w:line="230" w:lineRule="auto"/>
+            </w:pPr>
+            <w:r>
+              <w:rPr>
+                <w:rFonts w:ascii="Calibri" w:hAnsi="Calibri" w:eastAsia="Calibri" w:cs="Calibri"/>
+                <w:sz w:val="18"/>
+                <w:szCs w:val="18"/>
+              </w:rPr>
+              <w:t>1:00–2:00</w:t>
+            </w:r>
+          </w:p>
+        </w:tc>
+        <w:tc>
+          <w:tcPr>
+            <w:tcW w:w="1229" w:type="dxa"/>
+            <w:vAlign w:val="top"/>
+          </w:tcPr>
+          <w:p>
+            <w:pPr>
+              <w:spacing w:before="0" w:after="30" w:line="230" w:lineRule="auto"/>
+            </w:pPr>
+            <w:r>
+              <w:rPr>
+                <w:rFonts w:ascii="Calibri" w:hAnsi="Calibri" w:eastAsia="Calibri" w:cs="Calibri"/>
+                <w:sz w:val="18"/>
+                <w:szCs w:val="18"/>
+              </w:rPr>
+              <w:t>60 s</w:t>
             </w:r>
           </w:p>
         </w:tc>
@@ -368,7 +553,7 @@
       <w:tr>
         <w:tc>
           <w:tcPr>
-            <w:tcW w:w="1424" w:type="dxa"/>
+            <w:tcW w:w="1226" w:type="dxa"/>
             <w:vAlign w:val="top"/>
           </w:tcPr>
           <w:p>
@@ -387,7 +572,7 @@
         </w:tc>
         <w:tc>
           <w:tcPr>
-            <w:tcW w:w="1424" w:type="dxa"/>
+            <w:tcW w:w="1226" w:type="dxa"/>
             <w:vAlign w:val="top"/>
           </w:tcPr>
           <w:p>
@@ -406,39 +591,58 @@
         </w:tc>
         <w:tc>
           <w:tcPr>
-            <w:tcW w:w="4140" w:type="dxa"/>
-            <w:vAlign w:val="top"/>
-          </w:tcPr>
-          <w:p>
-            <w:pPr>
-              <w:spacing w:before="0" w:after="30" w:line="230" w:lineRule="auto"/>
-            </w:pPr>
-            <w:r>
-              <w:rPr>
-                <w:rFonts w:ascii="Calibri" w:hAnsi="Calibri" w:eastAsia="Calibri" w:cs="Calibri"/>
-                <w:sz w:val="18"/>
-                <w:szCs w:val="18"/>
-              </w:rPr>
-              <w:t>Administración recibe insumos; minicorte de Rodrigo para planificar</w:t>
-            </w:r>
-          </w:p>
-        </w:tc>
-        <w:tc>
-          <w:tcPr>
-            <w:tcW w:w="1516" w:type="dxa"/>
-            <w:vAlign w:val="top"/>
-          </w:tcPr>
-          <w:p>
-            <w:pPr>
-              <w:spacing w:before="0" w:after="30" w:line="230" w:lineRule="auto"/>
-            </w:pPr>
-            <w:r>
-              <w:rPr>
-                <w:rFonts w:ascii="Calibri" w:hAnsi="Calibri" w:eastAsia="Calibri" w:cs="Calibri"/>
-                <w:sz w:val="18"/>
-                <w:szCs w:val="18"/>
-              </w:rPr>
-              <w:t>1:56–2:54</w:t>
+            <w:tcW w:w="3531" w:type="dxa"/>
+            <w:vAlign w:val="top"/>
+          </w:tcPr>
+          <w:p>
+            <w:pPr>
+              <w:spacing w:before="0" w:after="30" w:line="230" w:lineRule="auto"/>
+            </w:pPr>
+            <w:r>
+              <w:rPr>
+                <w:rFonts w:ascii="Calibri" w:hAnsi="Calibri" w:eastAsia="Calibri" w:cs="Calibri"/>
+                <w:sz w:val="18"/>
+                <w:szCs w:val="18"/>
+              </w:rPr>
+              <w:t>Administración registra ingresos; minicorte de Rodrigo para planificar</w:t>
+            </w:r>
+          </w:p>
+        </w:tc>
+        <w:tc>
+          <w:tcPr>
+            <w:tcW w:w="1292" w:type="dxa"/>
+            <w:vAlign w:val="top"/>
+          </w:tcPr>
+          <w:p>
+            <w:pPr>
+              <w:spacing w:before="0" w:after="30" w:line="230" w:lineRule="auto"/>
+            </w:pPr>
+            <w:r>
+              <w:rPr>
+                <w:rFonts w:ascii="Calibri" w:hAnsi="Calibri" w:eastAsia="Calibri" w:cs="Calibri"/>
+                <w:sz w:val="18"/>
+                <w:szCs w:val="18"/>
+              </w:rPr>
+              <w:t>2:00–3:00</w:t>
+            </w:r>
+          </w:p>
+        </w:tc>
+        <w:tc>
+          <w:tcPr>
+            <w:tcW w:w="1229" w:type="dxa"/>
+            <w:vAlign w:val="top"/>
+          </w:tcPr>
+          <w:p>
+            <w:pPr>
+              <w:spacing w:before="0" w:after="30" w:line="230" w:lineRule="auto"/>
+            </w:pPr>
+            <w:r>
+              <w:rPr>
+                <w:rFonts w:ascii="Calibri" w:hAnsi="Calibri" w:eastAsia="Calibri" w:cs="Calibri"/>
+                <w:sz w:val="18"/>
+                <w:szCs w:val="18"/>
+              </w:rPr>
+              <w:t>60 s</w:t>
             </w:r>
           </w:p>
         </w:tc>
@@ -446,7 +650,7 @@
       <w:tr>
         <w:tc>
           <w:tcPr>
-            <w:tcW w:w="1424" w:type="dxa"/>
+            <w:tcW w:w="1226" w:type="dxa"/>
             <w:vAlign w:val="top"/>
           </w:tcPr>
           <w:p>
@@ -465,7 +669,7 @@
         </w:tc>
         <w:tc>
           <w:tcPr>
-            <w:tcW w:w="1424" w:type="dxa"/>
+            <w:tcW w:w="1226" w:type="dxa"/>
             <w:vAlign w:val="top"/>
           </w:tcPr>
           <w:p>
@@ -484,39 +688,58 @@
         </w:tc>
         <w:tc>
           <w:tcPr>
-            <w:tcW w:w="4140" w:type="dxa"/>
-            <w:vAlign w:val="top"/>
-          </w:tcPr>
-          <w:p>
-            <w:pPr>
-              <w:spacing w:before="0" w:after="30" w:line="230" w:lineRule="auto"/>
-            </w:pPr>
-            <w:r>
-              <w:rPr>
-                <w:rFonts w:ascii="Calibri" w:hAnsi="Calibri" w:eastAsia="Calibri" w:cs="Calibri"/>
-                <w:sz w:val="18"/>
-                <w:szCs w:val="18"/>
-              </w:rPr>
-              <w:t>Operario produce y registra el control</w:t>
-            </w:r>
-          </w:p>
-        </w:tc>
-        <w:tc>
-          <w:tcPr>
-            <w:tcW w:w="1516" w:type="dxa"/>
-            <w:vAlign w:val="top"/>
-          </w:tcPr>
-          <w:p>
-            <w:pPr>
-              <w:spacing w:before="0" w:after="30" w:line="230" w:lineRule="auto"/>
-            </w:pPr>
-            <w:r>
-              <w:rPr>
-                <w:rFonts w:ascii="Calibri" w:hAnsi="Calibri" w:eastAsia="Calibri" w:cs="Calibri"/>
-                <w:sz w:val="18"/>
-                <w:szCs w:val="18"/>
-              </w:rPr>
-              <w:t>2:54–3:52</w:t>
+            <w:tcW w:w="3531" w:type="dxa"/>
+            <w:vAlign w:val="top"/>
+          </w:tcPr>
+          <w:p>
+            <w:pPr>
+              <w:spacing w:before="0" w:after="30" w:line="230" w:lineRule="auto"/>
+            </w:pPr>
+            <w:r>
+              <w:rPr>
+                <w:rFonts w:ascii="Calibri" w:hAnsi="Calibri" w:eastAsia="Calibri" w:cs="Calibri"/>
+                <w:sz w:val="18"/>
+                <w:szCs w:val="18"/>
+              </w:rPr>
+              <w:t>El operario produce y registra el control</w:t>
+            </w:r>
+          </w:p>
+        </w:tc>
+        <w:tc>
+          <w:tcPr>
+            <w:tcW w:w="1292" w:type="dxa"/>
+            <w:vAlign w:val="top"/>
+          </w:tcPr>
+          <w:p>
+            <w:pPr>
+              <w:spacing w:before="0" w:after="30" w:line="230" w:lineRule="auto"/>
+            </w:pPr>
+            <w:r>
+              <w:rPr>
+                <w:rFonts w:ascii="Calibri" w:hAnsi="Calibri" w:eastAsia="Calibri" w:cs="Calibri"/>
+                <w:sz w:val="18"/>
+                <w:szCs w:val="18"/>
+              </w:rPr>
+              <w:t>3:00–4:00</w:t>
+            </w:r>
+          </w:p>
+        </w:tc>
+        <w:tc>
+          <w:tcPr>
+            <w:tcW w:w="1229" w:type="dxa"/>
+            <w:vAlign w:val="top"/>
+          </w:tcPr>
+          <w:p>
+            <w:pPr>
+              <w:spacing w:before="0" w:after="30" w:line="230" w:lineRule="auto"/>
+            </w:pPr>
+            <w:r>
+              <w:rPr>
+                <w:rFonts w:ascii="Calibri" w:hAnsi="Calibri" w:eastAsia="Calibri" w:cs="Calibri"/>
+                <w:sz w:val="18"/>
+                <w:szCs w:val="18"/>
+              </w:rPr>
+              <w:t>60 s</w:t>
             </w:r>
           </w:p>
         </w:tc>
@@ -524,7 +747,7 @@
       <w:tr>
         <w:tc>
           <w:tcPr>
-            <w:tcW w:w="1424" w:type="dxa"/>
+            <w:tcW w:w="1226" w:type="dxa"/>
             <w:vAlign w:val="top"/>
           </w:tcPr>
           <w:p>
@@ -543,7 +766,7 @@
         </w:tc>
         <w:tc>
           <w:tcPr>
-            <w:tcW w:w="1424" w:type="dxa"/>
+            <w:tcW w:w="1226" w:type="dxa"/>
             <w:vAlign w:val="top"/>
           </w:tcPr>
           <w:p>
@@ -562,39 +785,58 @@
         </w:tc>
         <w:tc>
           <w:tcPr>
-            <w:tcW w:w="4140" w:type="dxa"/>
-            <w:vAlign w:val="top"/>
-          </w:tcPr>
-          <w:p>
-            <w:pPr>
-              <w:spacing w:before="0" w:after="30" w:line="230" w:lineRule="auto"/>
-            </w:pPr>
-            <w:r>
-              <w:rPr>
-                <w:rFonts w:ascii="Calibri" w:hAnsi="Calibri" w:eastAsia="Calibri" w:cs="Calibri"/>
-                <w:sz w:val="18"/>
-                <w:szCs w:val="18"/>
-              </w:rPr>
-              <w:t>Cliente consulta su pedido y sus avisos</w:t>
-            </w:r>
-          </w:p>
-        </w:tc>
-        <w:tc>
-          <w:tcPr>
-            <w:tcW w:w="1516" w:type="dxa"/>
-            <w:vAlign w:val="top"/>
-          </w:tcPr>
-          <w:p>
-            <w:pPr>
-              <w:spacing w:before="0" w:after="30" w:line="230" w:lineRule="auto"/>
-            </w:pPr>
-            <w:r>
-              <w:rPr>
-                <w:rFonts w:ascii="Calibri" w:hAnsi="Calibri" w:eastAsia="Calibri" w:cs="Calibri"/>
-                <w:sz w:val="18"/>
-                <w:szCs w:val="18"/>
-              </w:rPr>
-              <w:t>3:52–4:50</w:t>
+            <w:tcW w:w="3531" w:type="dxa"/>
+            <w:vAlign w:val="top"/>
+          </w:tcPr>
+          <w:p>
+            <w:pPr>
+              <w:spacing w:before="0" w:after="30" w:line="230" w:lineRule="auto"/>
+            </w:pPr>
+            <w:r>
+              <w:rPr>
+                <w:rFonts w:ascii="Calibri" w:hAnsi="Calibri" w:eastAsia="Calibri" w:cs="Calibri"/>
+                <w:sz w:val="18"/>
+                <w:szCs w:val="18"/>
+              </w:rPr>
+              <w:t>Cliente Alfa consulta su pedido y sus avisos</w:t>
+            </w:r>
+          </w:p>
+        </w:tc>
+        <w:tc>
+          <w:tcPr>
+            <w:tcW w:w="1292" w:type="dxa"/>
+            <w:vAlign w:val="top"/>
+          </w:tcPr>
+          <w:p>
+            <w:pPr>
+              <w:spacing w:before="0" w:after="30" w:line="230" w:lineRule="auto"/>
+            </w:pPr>
+            <w:r>
+              <w:rPr>
+                <w:rFonts w:ascii="Calibri" w:hAnsi="Calibri" w:eastAsia="Calibri" w:cs="Calibri"/>
+                <w:sz w:val="18"/>
+                <w:szCs w:val="18"/>
+              </w:rPr>
+              <w:t>4:00–5:00</w:t>
+            </w:r>
+          </w:p>
+        </w:tc>
+        <w:tc>
+          <w:tcPr>
+            <w:tcW w:w="1229" w:type="dxa"/>
+            <w:vAlign w:val="top"/>
+          </w:tcPr>
+          <w:p>
+            <w:pPr>
+              <w:spacing w:before="0" w:after="30" w:line="230" w:lineRule="auto"/>
+            </w:pPr>
+            <w:r>
+              <w:rPr>
+                <w:rFonts w:ascii="Calibri" w:hAnsi="Calibri" w:eastAsia="Calibri" w:cs="Calibri"/>
+                <w:sz w:val="18"/>
+                <w:szCs w:val="18"/>
+              </w:rPr>
+              <w:t>60 s</w:t>
             </w:r>
           </w:p>
         </w:tc>
@@ -602,7 +844,7 @@
       <w:tr>
         <w:tc>
           <w:tcPr>
-            <w:tcW w:w="1424" w:type="dxa"/>
+            <w:tcW w:w="1226" w:type="dxa"/>
             <w:vAlign w:val="top"/>
           </w:tcPr>
           <w:p>
@@ -623,7 +865,7 @@
         </w:tc>
         <w:tc>
           <w:tcPr>
-            <w:tcW w:w="1424" w:type="dxa"/>
+            <w:tcW w:w="1226" w:type="dxa"/>
             <w:vAlign w:val="top"/>
           </w:tcPr>
           <w:p>
@@ -644,7 +886,7 @@
         </w:tc>
         <w:tc>
           <w:tcPr>
-            <w:tcW w:w="4140" w:type="dxa"/>
+            <w:tcW w:w="3531" w:type="dxa"/>
             <w:vAlign w:val="top"/>
           </w:tcPr>
           <w:p>
@@ -659,13 +901,13 @@
                 <w:b/>
                 <w:bCs/>
               </w:rPr>
-              <w:t>5 clips de 58 s</w:t>
-            </w:r>
-          </w:p>
-        </w:tc>
-        <w:tc>
-          <w:tcPr>
-            <w:tcW w:w="1516" w:type="dxa"/>
+              <w:t>5 clips de 60 s</w:t>
+            </w:r>
+          </w:p>
+        </w:tc>
+        <w:tc>
+          <w:tcPr>
+            <w:tcW w:w="1292" w:type="dxa"/>
             <w:vAlign w:val="top"/>
           </w:tcPr>
           <w:p>
@@ -680,7 +922,28 @@
                 <w:b/>
                 <w:bCs/>
               </w:rPr>
-              <w:t>290 s (4:50)</w:t>
+              <w:t>0:00–5:00</w:t>
+            </w:r>
+          </w:p>
+        </w:tc>
+        <w:tc>
+          <w:tcPr>
+            <w:tcW w:w="1229" w:type="dxa"/>
+            <w:vAlign w:val="top"/>
+          </w:tcPr>
+          <w:p>
+            <w:pPr>
+              <w:spacing w:before="0" w:after="30" w:line="230" w:lineRule="auto"/>
+            </w:pPr>
+            <w:r>
+              <w:rPr>
+                <w:rFonts w:ascii="Calibri" w:hAnsi="Calibri" w:eastAsia="Calibri" w:cs="Calibri"/>
+                <w:sz w:val="18"/>
+                <w:szCs w:val="18"/>
+                <w:b/>
+                <w:bCs/>
+              </w:rPr>
+              <w:t>300 s</w:t>
             </w:r>
           </w:p>
         </w:tc>
@@ -696,39 +959,57 @@
           <w:sz w:val="22"/>
           <w:szCs w:val="22"/>
         </w:rPr>
-        <w:t xml:space="preserve">Cada clip incluye rótulo, acción/voz y transición o cierre; no hay intro ni créditos adicionales. El objetivo editorial global es 285–295 s y el límite absoluto es 300 s. Consultar el </w:t>
-      </w:r>
-      <w:r>
-        <w:rPr>
-          <w:rFonts w:ascii="Calibri" w:hAnsi="Calibri" w:eastAsia="Calibri" w:cs="Calibri"/>
-          <w:sz w:val="22"/>
-          <w:szCs w:val="22"/>
-        </w:rPr>
-        <w:t>storyboard de montaje (storyboard-video.md)</w:t>
-      </w:r>
-      <w:r>
-        <w:rPr>
-          <w:rFonts w:ascii="Calibri" w:hAnsi="Calibri" w:eastAsia="Calibri" w:cs="Calibri"/>
-          <w:sz w:val="22"/>
-          <w:szCs w:val="22"/>
-        </w:rPr>
-        <w:t xml:space="preserve"> para los subpresupuestos y fotogramas reales de referencia, y el </w:t>
-      </w:r>
-      <w:r>
-        <w:rPr>
-          <w:rFonts w:ascii="Calibri" w:hAnsi="Calibri" w:eastAsia="Calibri" w:cs="Calibri"/>
-          <w:sz w:val="22"/>
-          <w:szCs w:val="22"/>
-        </w:rPr>
-        <w:t>ensayo operativo (ensayo-video.md)</w:t>
-      </w:r>
-      <w:r>
-        <w:rPr>
-          <w:rFonts w:ascii="Calibri" w:hAnsi="Calibri" w:eastAsia="Calibri" w:cs="Calibri"/>
-          <w:sz w:val="22"/>
-          <w:szCs w:val="22"/>
-        </w:rPr>
-        <w:t xml:space="preserve"> para preparar o repetir cada estado.</w:t>
+        <w:t xml:space="preserve">Cada clip tiene la misma estructura: rótulo de entrada de 0 a 3 s, metraje de la UI de 3 a 58 s y estado final quieto de 58 a 60 s, con fundido a negro en el último segundo. B5 reemplaza los últimos 6 s (54–60) por la tarjeta de cierre. No hay intro ni créditos fuera de los cinco clips. La </w:t>
+      </w:r>
+      <w:r>
+        <w:rPr>
+          <w:rFonts w:ascii="Calibri" w:hAnsi="Calibri" w:eastAsia="Calibri" w:cs="Calibri"/>
+          <w:sz w:val="22"/>
+          <w:szCs w:val="22"/>
+          <w:b/>
+          <w:bCs/>
+        </w:rPr>
+        <w:t>ventana de voz</w:t>
+      </w:r>
+      <w:r>
+        <w:rPr>
+          <w:rFonts w:ascii="Calibri" w:hAnsi="Calibri" w:eastAsia="Calibri" w:cs="Calibri"/>
+          <w:sz w:val="22"/>
+          <w:szCs w:val="22"/>
+        </w:rPr>
+        <w:t xml:space="preserve"> sugerida va de 3,5 a 57,5 s (en B5, hasta 54 s); cada locución ocupa unos 31–40 s a 130–150 palabras por minuto (ritmo supuesto), así que queda aire para pausas. Los cues segundo a segundo están en el </w:t>
+      </w:r>
+      <w:r>
+        <w:rPr>
+          <w:rFonts w:ascii="Calibri" w:hAnsi="Calibri" w:eastAsia="Calibri" w:cs="Calibri"/>
+          <w:sz w:val="22"/>
+          <w:szCs w:val="22"/>
+        </w:rPr>
+        <w:t>storyboard (storyboard-video.md)</w:t>
+      </w:r>
+      <w:r>
+        <w:rPr>
+          <w:rFonts w:ascii="Calibri" w:hAnsi="Calibri" w:eastAsia="Calibri" w:cs="Calibri"/>
+          <w:sz w:val="22"/>
+          <w:szCs w:val="22"/>
+        </w:rPr>
+        <w:t xml:space="preserve"> y la preparación de la voz, en el </w:t>
+      </w:r>
+      <w:r>
+        <w:rPr>
+          <w:rFonts w:ascii="Calibri" w:hAnsi="Calibri" w:eastAsia="Calibri" w:cs="Calibri"/>
+          <w:sz w:val="22"/>
+          <w:szCs w:val="22"/>
+        </w:rPr>
+        <w:t>ensayo (ensayo-video.md)</w:t>
+      </w:r>
+      <w:r>
+        <w:rPr>
+          <w:rFonts w:ascii="Calibri" w:hAnsi="Calibri" w:eastAsia="Calibri" w:cs="Calibri"/>
+          <w:sz w:val="22"/>
+          <w:szCs w:val="22"/>
+        </w:rPr>
+        <w:t>.</w:t>
       </w:r>
     </w:p>
     <w:p>
@@ -793,7 +1074,7 @@
           <w:sz w:val="22"/>
           <w:szCs w:val="22"/>
         </w:rPr>
-        <w:t xml:space="preserve">). La vista previa y cotización formal muestran </w:t>
+        <w:t xml:space="preserve">). La vista previa y la cotización formal muestran </w:t>
       </w:r>
       <w:r>
         <w:rPr>
@@ -901,7 +1182,7 @@
           <w:sz w:val="22"/>
           <w:szCs w:val="22"/>
         </w:rPr>
-        <w:t>; ese saldo queda bajo los mínimos registrados. El consumo y el saldo se conservan como verificación en esta guía y en el JSON; B4 no los locuta. La cuenta, el artículo y los materiales son datos sintéticos del seed.</w:t>
+        <w:t>; ese saldo queda bajo los mínimos registrados. El consumo (576 g / 288 g) se ve en pantalla al final de B4, pero no se locuta. La cuenta, el artículo y los materiales provienen del seed del prototipo.</w:t>
       </w:r>
     </w:p>
     <w:p>
@@ -914,7 +1195,7 @@
           <w:sz w:val="22"/>
           <w:szCs w:val="22"/>
         </w:rPr>
-        <w:t xml:space="preserve">Los IDs de solicitud, cotización y pedido (incluidos números PED) se generan durante cada corrida y </w:t>
+        <w:t xml:space="preserve">Los IDs de solicitud, cotización y pedido (incluidos números PED) y las fechas se generan durante cada corrida y </w:t>
       </w:r>
       <w:r>
         <w:rPr>
@@ -932,7 +1213,7 @@
           <w:sz w:val="22"/>
           <w:szCs w:val="22"/>
         </w:rPr>
-        <w:t>. No fijar en rótulos o locución los IDs concretos que aparecen en el registro de una ejecución.</w:t>
+        <w:t>. No fijar en rótulos ni en la locución los IDs concretos que aparecen en una ejecución.</w:t>
       </w:r>
     </w:p>
     <w:p>
@@ -961,7 +1242,7 @@
           <w:sz w:val="22"/>
           <w:szCs w:val="22"/>
         </w:rPr>
-        <w:t>Las etiquetas, rótulos, acciones y notas no se leen. Los números de la locución se escriben como se pronuncian. Conteo: palabras habladas dentro de cada bloque LOC, tokens separados por espacios que contienen al menos una letra; se ignoran signos de puntuación. El desglose es explícito para facilitar la lectura por persona. Los delimitadores LOC son comentarios invisibles de Markdown para el conteo, no parte de la locución; al preparar Word, deben omitirse y no mostrarse como texto.</w:t>
+        <w:t>Las etiquetas, rótulos, acciones y notas no se leen. Los números de la locución se escriben como se pronuncian. Conteo: palabras habladas dentro de cada bloque LOC, tokens separados por espacios que contienen al menos una letra; se ignoran signos de puntuación. Los delimitadores LOC son comentarios invisibles de Markdown para el conteo, no parte de la locución; al preparar Word, deben omitirse y no mostrarse como texto.</w:t>
       </w:r>
     </w:p>
     <w:p>
@@ -977,7 +1258,7 @@
           <w:b/>
           <w:bCs/>
         </w:rPr>
-        <w:t>B1 — Persona1 — Cliente configura la solicitud (0:00–0:58)</w:t>
+        <w:t>B1 — Persona1 — Cliente Alfa registra la solicitud (0:00–1:00)</w:t>
       </w:r>
     </w:p>
     <w:p>
@@ -992,6 +1273,24 @@
           <w:b/>
           <w:bCs/>
         </w:rPr>
+        <w:t>Rótulo (0–3 s):</w:t>
+      </w:r>
+      <w:r>
+        <w:rPr>
+          <w:rFonts w:ascii="Calibri" w:hAnsi="Calibri" w:eastAsia="Calibri" w:cs="Calibri"/>
+          <w:sz w:val="22"/>
+          <w:szCs w:val="22"/>
+        </w:rPr>
+        <w:t xml:space="preserve"> «1 · Cliente Alfa pide una cotización» / «Portal del cliente · sin solicitudes». </w:t>
+      </w:r>
+      <w:r>
+        <w:rPr>
+          <w:rFonts w:ascii="Calibri" w:hAnsi="Calibri" w:eastAsia="Calibri" w:cs="Calibri"/>
+          <w:sz w:val="22"/>
+          <w:szCs w:val="22"/>
+          <w:b/>
+          <w:bCs/>
+        </w:rPr>
         <w:t>Entrada:</w:t>
       </w:r>
       <w:r>
@@ -1018,7 +1317,25 @@
           <w:sz w:val="22"/>
           <w:szCs w:val="22"/>
         </w:rPr>
-        <w:t xml:space="preserve"> Nueva solicitud → ART-001 → 2 gruesas → revisar la vista previa → teléfono y consentimiento → enviar → volver al portal. </w:t>
+        <w:t xml:space="preserve"> Nueva solicitud → ART-001 → 2 gruesas → revisar la vista previa → teléfono y casilla «Autorizo el registro de estos datos para la solicitud.» → </w:t>
+      </w:r>
+      <w:r>
+        <w:rPr>
+          <w:rFonts w:ascii="Calibri" w:hAnsi="Calibri" w:eastAsia="Calibri" w:cs="Calibri"/>
+          <w:sz w:val="22"/>
+          <w:szCs w:val="22"/>
+          <w:b/>
+          <w:bCs/>
+        </w:rPr>
+        <w:t>Registrar solicitud</w:t>
+      </w:r>
+      <w:r>
+        <w:rPr>
+          <w:rFonts w:ascii="Calibri" w:hAnsi="Calibri" w:eastAsia="Calibri" w:cs="Calibri"/>
+          <w:sz w:val="22"/>
+          <w:szCs w:val="22"/>
+        </w:rPr>
+        <w:t xml:space="preserve"> → Volver a mi portal. </w:t>
       </w:r>
       <w:r>
         <w:rPr>
@@ -1036,7 +1353,7 @@
           <w:sz w:val="22"/>
           <w:szCs w:val="22"/>
         </w:rPr>
-        <w:t xml:space="preserve"> solicitud Nueva, asociada a la cuenta del cliente; terminar con el listado visible y corte de 2 s.</w:t>
+        <w:t xml:space="preserve"> solicitud Nueva en «Solicitudes enviadas»; quieto y fundido de 58 a 60 s. En pantalla se lee «No se notificó al equipo comercial.»: la locución no dice que la solicitud llega al equipo comercial.</w:t>
       </w:r>
     </w:p>
     <w:p>
@@ -1051,7 +1368,7 @@
           <w:b/>
           <w:bCs/>
         </w:rPr>
-        <w:t>Locución — 84 palabras:</w:t>
+        <w:t>Locución — 86 palabras:</w:t>
       </w:r>
     </w:p>
     <w:p>
@@ -1064,7 +1381,7 @@
           <w:sz w:val="22"/>
           <w:szCs w:val="22"/>
         </w:rPr>
-        <w:t>Cliente Alfa entra a su portal, todavía sin solicitudes, y abre Nueva solicitud. Elige el cordón ART cero cero uno y pide dos gruesas, es decir, doscientos ochenta y ocho cordones. La vista previa calcula veintiún mil seiscientos pesos netos, cuatro mil quinientos treinta y seis de IVA y veintiséis mil ciento treinta y seis en total. Es una referencia, no una cotización formal. Completa su teléfono, acepta el uso de sus datos y envía. La solicitud aparece en su portal con estado Nueva.</w:t>
+        <w:t>Cliente Alfa entra a su portal, todavía sin solicitudes, y abre Nueva solicitud. Elige el cordón ART cero cero uno y pide dos gruesas, es decir, doscientos ochenta y ocho cordones. La vista previa calcula veintiún mil seiscientos pesos netos, cuatro mil quinientos treinta y seis de IVA y veintiséis mil ciento treinta y seis en total. Es una referencia, no una cotización formal. Completa su teléfono, autoriza el registro de sus datos y registra la solicitud. La solicitud aparece en su portal con estado Nueva.</w:t>
       </w:r>
     </w:p>
     <w:p>
@@ -1080,7 +1397,7 @@
           <w:b/>
           <w:bCs/>
         </w:rPr>
-        <w:t>B2 — Persona2 — Comercial convierte cotización en pedido (0:58–1:56)</w:t>
+        <w:t>B2 — Persona2 — Comercial convierte cotización en pedido (1:00–2:00)</w:t>
       </w:r>
     </w:p>
     <w:p>
@@ -1095,6 +1412,24 @@
           <w:b/>
           <w:bCs/>
         </w:rPr>
+        <w:t>Rótulo (0–3 s):</w:t>
+      </w:r>
+      <w:r>
+        <w:rPr>
+          <w:rFonts w:ascii="Calibri" w:hAnsi="Calibri" w:eastAsia="Calibri" w:cs="Calibri"/>
+          <w:sz w:val="22"/>
+          <w:szCs w:val="22"/>
+        </w:rPr>
+        <w:t xml:space="preserve"> «2 · Comercial: de la cotización al pedido» / «Rodrigo · solicitud Nueva de Cliente Alfa». </w:t>
+      </w:r>
+      <w:r>
+        <w:rPr>
+          <w:rFonts w:ascii="Calibri" w:hAnsi="Calibri" w:eastAsia="Calibri" w:cs="Calibri"/>
+          <w:sz w:val="22"/>
+          <w:szCs w:val="22"/>
+          <w:b/>
+          <w:bCs/>
+        </w:rPr>
         <w:t>Entrada:</w:t>
       </w:r>
       <w:r>
@@ -1121,7 +1456,7 @@
           <w:sz w:val="22"/>
           <w:szCs w:val="22"/>
         </w:rPr>
-        <w:t xml:space="preserve"> Preparar cotización; mantener 25 % de recargo y 7 días; crear, enviar propuesta, registrar aceptación y convertir en pedido. </w:t>
+        <w:t xml:space="preserve"> Preparar cotización; mantener 25 % de recargo y 7 días; Crear cotización, Enviar propuesta, Registrar aceptación y Convertir en pedido; abrir la orden desde Pedidos. </w:t>
       </w:r>
       <w:r>
         <w:rPr>
@@ -1139,7 +1474,7 @@
           <w:sz w:val="22"/>
           <w:szCs w:val="22"/>
         </w:rPr>
-        <w:t xml:space="preserve"> mostrar pedido Pendiente con reservas 400/200 g y faltantes 176/88 g; transición de 2 s. No cambiar al portal del cliente dentro de este clip.</w:t>
+        <w:t xml:space="preserve"> pedido Pendiente con reservas 400/200 g y faltantes 176/88 g; quieto y fundido de 58 a 60 s. No cambiar al portal del cliente dentro de este clip.</w:t>
       </w:r>
     </w:p>
     <w:p>
@@ -1183,7 +1518,7 @@
           <w:b/>
           <w:bCs/>
         </w:rPr>
-        <w:t>B3 — Persona3 — Abastecimiento y plan (1:56–2:54)</w:t>
+        <w:t>B3 — Persona3 — Abastecimiento y plan (2:00–3:00)</w:t>
       </w:r>
     </w:p>
     <w:p>
@@ -1198,6 +1533,24 @@
           <w:b/>
           <w:bCs/>
         </w:rPr>
+        <w:t>Rótulo (0–3 s):</w:t>
+      </w:r>
+      <w:r>
+        <w:rPr>
+          <w:rFonts w:ascii="Calibri" w:hAnsi="Calibri" w:eastAsia="Calibri" w:cs="Calibri"/>
+          <w:sz w:val="22"/>
+          <w:szCs w:val="22"/>
+        </w:rPr>
+        <w:t xml:space="preserve"> «3 · Abastecimiento y plan» / «Lorena · pedido con faltantes de 176 g y 88 g». </w:t>
+      </w:r>
+      <w:r>
+        <w:rPr>
+          <w:rFonts w:ascii="Calibri" w:hAnsi="Calibri" w:eastAsia="Calibri" w:cs="Calibri"/>
+          <w:sz w:val="22"/>
+          <w:szCs w:val="22"/>
+          <w:b/>
+          <w:bCs/>
+        </w:rPr>
         <w:t>Entrada:</w:t>
       </w:r>
       <w:r>
@@ -1206,7 +1559,7 @@
           <w:sz w:val="22"/>
           <w:szCs w:val="22"/>
         </w:rPr>
-        <w:t xml:space="preserve"> Lorena, en Stock e insumos, ve el pedido y sus dos faltantes. </w:t>
+        <w:t xml:space="preserve"> Lorena, en Stock e insumos, ve «264 g de faltante». </w:t>
       </w:r>
       <w:r>
         <w:rPr>
@@ -1224,7 +1577,7 @@
           <w:sz w:val="22"/>
           <w:szCs w:val="22"/>
         </w:rPr>
-        <w:t xml:space="preserve"> registrar 200 g de hilado negro y 100 g de alma negra; corte dentro del clip a Rodrigo, que asigna Máquina 04 y prioridad 1. </w:t>
+        <w:t xml:space="preserve"> registrar 200 g de hilado negro y 100 g de alma negra con Registrar ingreso; tarjeta «Rodrigo · planificación» de 1 s (39–40 s); Rodrigo asigna Máquina 04 y prioridad 1 y pulsa Guardar plan. </w:t>
       </w:r>
       <w:r>
         <w:rPr>
@@ -1242,7 +1595,7 @@
           <w:sz w:val="22"/>
           <w:szCs w:val="22"/>
         </w:rPr>
-        <w:t xml:space="preserve"> mostrar faltantes en cero, ingresos en Movimientos recientes y, tras el corte, reserva completa y plan guardado; transición de 2 s. El microrrótulo «Rodrigo · planificación» dura 1 s y está incluido en la ventana de acción.</w:t>
+        <w:t xml:space="preserve"> faltantes en cero, ingresos en Movimientos recientes y, tras el corte, reserva completa y plan guardado; quieto y fundido de 58 a 60 s.</w:t>
       </w:r>
     </w:p>
     <w:p>
@@ -1286,7 +1639,7 @@
           <w:b/>
           <w:bCs/>
         </w:rPr>
-        <w:t>B4 — Persona4 — El operario produce y controla (2:54–3:52)</w:t>
+        <w:t>B4 — Persona4 — El operario produce y controla (3:00–4:00)</w:t>
       </w:r>
     </w:p>
     <w:p>
@@ -1301,6 +1654,24 @@
           <w:b/>
           <w:bCs/>
         </w:rPr>
+        <w:t>Rótulo (0–3 s):</w:t>
+      </w:r>
+      <w:r>
+        <w:rPr>
+          <w:rFonts w:ascii="Calibri" w:hAnsi="Calibri" w:eastAsia="Calibri" w:cs="Calibri"/>
+          <w:sz w:val="22"/>
+          <w:szCs w:val="22"/>
+        </w:rPr>
+        <w:t xml:space="preserve"> «4 · Operario: producción y control» / «Máquina 04 · reserva completa». </w:t>
+      </w:r>
+      <w:r>
+        <w:rPr>
+          <w:rFonts w:ascii="Calibri" w:hAnsi="Calibri" w:eastAsia="Calibri" w:cs="Calibri"/>
+          <w:sz w:val="22"/>
+          <w:szCs w:val="22"/>
+          <w:b/>
+          <w:bCs/>
+        </w:rPr>
         <w:t>Entrada:</w:t>
       </w:r>
       <w:r>
@@ -1327,7 +1698,7 @@
           <w:sz w:val="22"/>
           <w:szCs w:val="22"/>
         </w:rPr>
-        <w:t xml:space="preserve"> abrir la orden, iniciar producción, cargar 288 unidades acumuladas, marcar control de calidad aprobado y guardar. </w:t>
+        <w:t xml:space="preserve"> Ver orden, Iniciar producción, cargar 288 unidades acumuladas, marcar Control de calidad aprobado y Guardar avance. </w:t>
       </w:r>
       <w:r>
         <w:rPr>
@@ -1345,7 +1716,7 @@
           <w:sz w:val="22"/>
           <w:szCs w:val="22"/>
         </w:rPr>
-        <w:t xml:space="preserve"> pedido Listo y Calidad verificada; terminar en la UI del operario con transición de 2 s. El control es un registro manual, no una medición automática. El consumo y el saldo final de 24/12 g se confirman en C4 y el JSON, no se locutan ni se presentan como si aparecieran en esta pantalla.</w:t>
+        <w:t xml:space="preserve"> pedido Listo; de 48 a 58 s se ven «Consumido 576 g» y «Consumido 288 g»; quieto y fundido de 58 a 60 s. El control es un registro manual, no una medición automática. El consumo y el saldo de 24/12 g no se locutan.</w:t>
       </w:r>
     </w:p>
     <w:p>
@@ -1389,7 +1760,7 @@
           <w:b/>
           <w:bCs/>
         </w:rPr>
-        <w:t>B5 — Persona5 — Cliente consulta pedido y avisos (3:52–4:50)</w:t>
+        <w:t>B5 — Persona5 — Cliente Alfa consulta pedido y avisos (4:00–5:00)</w:t>
       </w:r>
     </w:p>
     <w:p>
@@ -1404,6 +1775,24 @@
           <w:b/>
           <w:bCs/>
         </w:rPr>
+        <w:t>Rótulo (0–3 s):</w:t>
+      </w:r>
+      <w:r>
+        <w:rPr>
+          <w:rFonts w:ascii="Calibri" w:hAnsi="Calibri" w:eastAsia="Calibri" w:cs="Calibri"/>
+          <w:sz w:val="22"/>
+          <w:szCs w:val="22"/>
+        </w:rPr>
+        <w:t xml:space="preserve"> «5 · Cliente Alfa: seguimiento y avisos» / «Pedido terminado». </w:t>
+      </w:r>
+      <w:r>
+        <w:rPr>
+          <w:rFonts w:ascii="Calibri" w:hAnsi="Calibri" w:eastAsia="Calibri" w:cs="Calibri"/>
+          <w:sz w:val="22"/>
+          <w:szCs w:val="22"/>
+          <w:b/>
+          <w:bCs/>
+        </w:rPr>
         <w:t>Entrada:</w:t>
       </w:r>
       <w:r>
@@ -1430,7 +1819,7 @@
           <w:sz w:val="22"/>
           <w:szCs w:val="22"/>
         </w:rPr>
-        <w:t xml:space="preserve"> mostrar 288/288 unidades, 100 % y Calidad verificada; bajar a Mis avisos y revisar los registros del pedido. </w:t>
+        <w:t xml:space="preserve"> mostrar en Mis pedidos 288 / 288 unidades y Calidad verificada; bajar a Mis avisos y mostrar los avisos con el badge Registrada. </w:t>
       </w:r>
       <w:r>
         <w:rPr>
@@ -1448,7 +1837,7 @@
           <w:sz w:val="22"/>
           <w:szCs w:val="22"/>
         </w:rPr>
-        <w:t xml:space="preserve"> se ven los avisos registrados; dedicar los últimos 6 s al rótulo «Prototipo académico local · datos sintéticos · avisos registrados, sin envíos externos». Solo portal del cliente: no mostrar Bandeja de avisos interna ni afirmar que un mensaje fue enviado.</w:t>
+        <w:t xml:space="preserve"> de 54 a 60 s, tarjeta de cierre «JACSA Gestión · Prototipo funcional» con la línea «Los avisos quedan registrados; no se envían correos ni mensajes.» y fundido a negro en el último segundo. Solo portal del cliente: no mostrar la Bandeja de avisos interna ni afirmar que un mensaje fue enviado.</w:t>
       </w:r>
     </w:p>
     <w:p>
@@ -1463,7 +1852,7 @@
           <w:b/>
           <w:bCs/>
         </w:rPr>
-        <w:t>Locución — 79 palabras:</w:t>
+        <w:t>Locución — 78 palabras:</w:t>
       </w:r>
     </w:p>
     <w:p>
@@ -1476,7 +1865,7 @@
           <w:sz w:val="22"/>
           <w:szCs w:val="22"/>
         </w:rPr>
-        <w:t>Cliente Alfa vuelve a su portal. En pedidos en curso ve su pedido Listo, doscientos ochenta y ocho de doscientas ochenta y ocho unidades, con calidad verificada. Se desplaza a Mis avisos y ve los eventos del pedido, como el inicio de producción y el pedido listo. Cada aviso figura como registrado. Quedó guardado en el sistema, sin envío de correo ni de mensajes. Así recorre un pedido completo, de la solicitud a la producción, con datos de prueba.</w:t>
+        <w:t>Cliente Alfa vuelve a su portal. En pedidos en curso ve su pedido Listo, doscientos ochenta y ocho de doscientas ochenta y ocho unidades, con calidad verificada. Se desplaza a Mis avisos y ve los eventos del pedido, como el inicio de producción y el pedido listo. Cada aviso figura como registrado. Quedó guardado en el sistema, sin envío de correo ni de mensajes. Así recorre un pedido completo, de la solicitud a la producción y el seguimiento.</w:t>
       </w:r>
     </w:p>
     <w:p>
@@ -1492,7 +1881,7 @@
           <w:b/>
           <w:bCs/>
         </w:rPr>
-        <w:t>Conteo hablado</w:t>
+        <w:t>Conteo hablado y tiempo de voz</w:t>
       </w:r>
     </w:p>
     <w:tbl>
@@ -1515,9 +1904,11 @@
         </w:tblCellMar>
       </w:tblPr>
       <w:tblGrid>
-        <w:gridCol w:w="2834"/>
-        <w:gridCol w:w="2834"/>
-        <w:gridCol w:w="2836"/>
+        <w:gridCol w:w="1700"/>
+        <w:gridCol w:w="1700"/>
+        <w:gridCol w:w="1700"/>
+        <w:gridCol w:w="1700"/>
+        <w:gridCol w:w="1704"/>
       </w:tblGrid>
       <w:tr>
         <w:trPr>
@@ -1525,19 +1916,19 @@
         </w:trPr>
         <w:tc>
           <w:tcPr>
-            <w:tcW w:w="2834" w:type="dxa"/>
+            <w:tcW w:w="1700" w:type="dxa"/>
             <w:shd w:val="clear" w:fill="EAF0F6"/>
             <w:vAlign w:val="top"/>
           </w:tcPr>
           <w:p>
             <w:pPr>
-              <w:spacing w:before="0" w:after="100" w:line="276" w:lineRule="auto"/>
-            </w:pPr>
-            <w:r>
-              <w:rPr>
-                <w:rFonts w:ascii="Calibri" w:hAnsi="Calibri" w:eastAsia="Calibri" w:cs="Calibri"/>
-                <w:sz w:val="20"/>
-                <w:szCs w:val="20"/>
+              <w:spacing w:before="0" w:after="30" w:line="230" w:lineRule="auto"/>
+            </w:pPr>
+            <w:r>
+              <w:rPr>
+                <w:rFonts w:ascii="Calibri" w:hAnsi="Calibri" w:eastAsia="Calibri" w:cs="Calibri"/>
+                <w:sz w:val="18"/>
+                <w:szCs w:val="18"/>
                 <w:b/>
                 <w:bCs/>
               </w:rPr>
@@ -1547,19 +1938,19 @@
         </w:tc>
         <w:tc>
           <w:tcPr>
-            <w:tcW w:w="2834" w:type="dxa"/>
+            <w:tcW w:w="1700" w:type="dxa"/>
             <w:shd w:val="clear" w:fill="EAF0F6"/>
             <w:vAlign w:val="top"/>
           </w:tcPr>
           <w:p>
             <w:pPr>
-              <w:spacing w:before="0" w:after="100" w:line="276" w:lineRule="auto"/>
-            </w:pPr>
-            <w:r>
-              <w:rPr>
-                <w:rFonts w:ascii="Calibri" w:hAnsi="Calibri" w:eastAsia="Calibri" w:cs="Calibri"/>
-                <w:sz w:val="20"/>
-                <w:szCs w:val="20"/>
+              <w:spacing w:before="0" w:after="30" w:line="230" w:lineRule="auto"/>
+            </w:pPr>
+            <w:r>
+              <w:rPr>
+                <w:rFonts w:ascii="Calibri" w:hAnsi="Calibri" w:eastAsia="Calibri" w:cs="Calibri"/>
+                <w:sz w:val="18"/>
+                <w:szCs w:val="18"/>
                 <w:b/>
                 <w:bCs/>
               </w:rPr>
@@ -1569,19 +1960,19 @@
         </w:tc>
         <w:tc>
           <w:tcPr>
-            <w:tcW w:w="2836" w:type="dxa"/>
+            <w:tcW w:w="1700" w:type="dxa"/>
             <w:shd w:val="clear" w:fill="EAF0F6"/>
             <w:vAlign w:val="top"/>
           </w:tcPr>
           <w:p>
             <w:pPr>
-              <w:spacing w:before="0" w:after="100" w:line="276" w:lineRule="auto"/>
-            </w:pPr>
-            <w:r>
-              <w:rPr>
-                <w:rFonts w:ascii="Calibri" w:hAnsi="Calibri" w:eastAsia="Calibri" w:cs="Calibri"/>
-                <w:sz w:val="20"/>
-                <w:szCs w:val="20"/>
+              <w:spacing w:before="0" w:after="30" w:line="230" w:lineRule="auto"/>
+            </w:pPr>
+            <w:r>
+              <w:rPr>
+                <w:rFonts w:ascii="Calibri" w:hAnsi="Calibri" w:eastAsia="Calibri" w:cs="Calibri"/>
+                <w:sz w:val="18"/>
+                <w:szCs w:val="18"/>
                 <w:b/>
                 <w:bCs/>
               </w:rPr>
@@ -1589,22 +1980,66 @@
             </w:r>
           </w:p>
         </w:tc>
+        <w:tc>
+          <w:tcPr>
+            <w:tcW w:w="1700" w:type="dxa"/>
+            <w:shd w:val="clear" w:fill="EAF0F6"/>
+            <w:vAlign w:val="top"/>
+          </w:tcPr>
+          <w:p>
+            <w:pPr>
+              <w:spacing w:before="0" w:after="30" w:line="230" w:lineRule="auto"/>
+            </w:pPr>
+            <w:r>
+              <w:rPr>
+                <w:rFonts w:ascii="Calibri" w:hAnsi="Calibri" w:eastAsia="Calibri" w:cs="Calibri"/>
+                <w:sz w:val="18"/>
+                <w:szCs w:val="18"/>
+                <w:b/>
+                <w:bCs/>
+              </w:rPr>
+              <w:t>Voz estimada a 130–150 ppm</w:t>
+            </w:r>
+          </w:p>
+        </w:tc>
+        <w:tc>
+          <w:tcPr>
+            <w:tcW w:w="1704" w:type="dxa"/>
+            <w:shd w:val="clear" w:fill="EAF0F6"/>
+            <w:vAlign w:val="top"/>
+          </w:tcPr>
+          <w:p>
+            <w:pPr>
+              <w:spacing w:before="0" w:after="30" w:line="230" w:lineRule="auto"/>
+            </w:pPr>
+            <w:r>
+              <w:rPr>
+                <w:rFonts w:ascii="Calibri" w:hAnsi="Calibri" w:eastAsia="Calibri" w:cs="Calibri"/>
+                <w:sz w:val="18"/>
+                <w:szCs w:val="18"/>
+                <w:b/>
+                <w:bCs/>
+              </w:rPr>
+              <w:t>Clip</w:t>
+            </w:r>
+          </w:p>
+        </w:tc>
       </w:tr>
       <w:tr>
         <w:tc>
           <w:tcPr>
-            <w:tcW w:w="2834" w:type="dxa"/>
-            <w:vAlign w:val="top"/>
-          </w:tcPr>
-          <w:p>
-            <w:pPr>
-              <w:spacing w:before="0" w:after="100" w:line="276" w:lineRule="auto"/>
-            </w:pPr>
-            <w:r>
-              <w:rPr>
-                <w:rFonts w:ascii="Calibri" w:hAnsi="Calibri" w:eastAsia="Calibri" w:cs="Calibri"/>
-                <w:sz w:val="20"/>
-                <w:szCs w:val="20"/>
+            <w:tcW w:w="1700" w:type="dxa"/>
+            <w:vAlign w:val="top"/>
+          </w:tcPr>
+          <w:p>
+            <w:pPr>
+              <w:spacing w:before="0" w:after="30" w:line="230" w:lineRule="auto"/>
+            </w:pPr>
+            <w:r>
+              <w:rPr>
+                <w:rFonts w:ascii="Calibri" w:hAnsi="Calibri" w:eastAsia="Calibri" w:cs="Calibri"/>
+                <w:sz w:val="18"/>
+                <w:szCs w:val="18"/>
               </w:rPr>
               <w:t>Persona1</w:t>
             </w:r>
@@ -1612,18 +2047,18 @@
         </w:tc>
         <w:tc>
           <w:tcPr>
-            <w:tcW w:w="2834" w:type="dxa"/>
-            <w:vAlign w:val="top"/>
-          </w:tcPr>
-          <w:p>
-            <w:pPr>
-              <w:spacing w:before="0" w:after="100" w:line="276" w:lineRule="auto"/>
-            </w:pPr>
-            <w:r>
-              <w:rPr>
-                <w:rFonts w:ascii="Calibri" w:hAnsi="Calibri" w:eastAsia="Calibri" w:cs="Calibri"/>
-                <w:sz w:val="20"/>
-                <w:szCs w:val="20"/>
+            <w:tcW w:w="1700" w:type="dxa"/>
+            <w:vAlign w:val="top"/>
+          </w:tcPr>
+          <w:p>
+            <w:pPr>
+              <w:spacing w:before="0" w:after="30" w:line="230" w:lineRule="auto"/>
+            </w:pPr>
+            <w:r>
+              <w:rPr>
+                <w:rFonts w:ascii="Calibri" w:hAnsi="Calibri" w:eastAsia="Calibri" w:cs="Calibri"/>
+                <w:sz w:val="18"/>
+                <w:szCs w:val="18"/>
               </w:rPr>
               <w:t>B1</w:t>
             </w:r>
@@ -1631,20 +2066,58 @@
         </w:tc>
         <w:tc>
           <w:tcPr>
-            <w:tcW w:w="2836" w:type="dxa"/>
-            <w:vAlign w:val="top"/>
-          </w:tcPr>
-          <w:p>
-            <w:pPr>
-              <w:spacing w:before="0" w:after="100" w:line="276" w:lineRule="auto"/>
-            </w:pPr>
-            <w:r>
-              <w:rPr>
-                <w:rFonts w:ascii="Calibri" w:hAnsi="Calibri" w:eastAsia="Calibri" w:cs="Calibri"/>
-                <w:sz w:val="20"/>
-                <w:szCs w:val="20"/>
-              </w:rPr>
-              <w:t>84</w:t>
+            <w:tcW w:w="1700" w:type="dxa"/>
+            <w:vAlign w:val="top"/>
+          </w:tcPr>
+          <w:p>
+            <w:pPr>
+              <w:spacing w:before="0" w:after="30" w:line="230" w:lineRule="auto"/>
+            </w:pPr>
+            <w:r>
+              <w:rPr>
+                <w:rFonts w:ascii="Calibri" w:hAnsi="Calibri" w:eastAsia="Calibri" w:cs="Calibri"/>
+                <w:sz w:val="18"/>
+                <w:szCs w:val="18"/>
+              </w:rPr>
+              <w:t>86</w:t>
+            </w:r>
+          </w:p>
+        </w:tc>
+        <w:tc>
+          <w:tcPr>
+            <w:tcW w:w="1700" w:type="dxa"/>
+            <w:vAlign w:val="top"/>
+          </w:tcPr>
+          <w:p>
+            <w:pPr>
+              <w:spacing w:before="0" w:after="30" w:line="230" w:lineRule="auto"/>
+            </w:pPr>
+            <w:r>
+              <w:rPr>
+                <w:rFonts w:ascii="Calibri" w:hAnsi="Calibri" w:eastAsia="Calibri" w:cs="Calibri"/>
+                <w:sz w:val="18"/>
+                <w:szCs w:val="18"/>
+              </w:rPr>
+              <w:t>34–40 s</w:t>
+            </w:r>
+          </w:p>
+        </w:tc>
+        <w:tc>
+          <w:tcPr>
+            <w:tcW w:w="1704" w:type="dxa"/>
+            <w:vAlign w:val="top"/>
+          </w:tcPr>
+          <w:p>
+            <w:pPr>
+              <w:spacing w:before="0" w:after="30" w:line="230" w:lineRule="auto"/>
+            </w:pPr>
+            <w:r>
+              <w:rPr>
+                <w:rFonts w:ascii="Calibri" w:hAnsi="Calibri" w:eastAsia="Calibri" w:cs="Calibri"/>
+                <w:sz w:val="18"/>
+                <w:szCs w:val="18"/>
+              </w:rPr>
+              <w:t>60 s</w:t>
             </w:r>
           </w:p>
         </w:tc>
@@ -1652,18 +2125,18 @@
       <w:tr>
         <w:tc>
           <w:tcPr>
-            <w:tcW w:w="2834" w:type="dxa"/>
-            <w:vAlign w:val="top"/>
-          </w:tcPr>
-          <w:p>
-            <w:pPr>
-              <w:spacing w:before="0" w:after="100" w:line="276" w:lineRule="auto"/>
-            </w:pPr>
-            <w:r>
-              <w:rPr>
-                <w:rFonts w:ascii="Calibri" w:hAnsi="Calibri" w:eastAsia="Calibri" w:cs="Calibri"/>
-                <w:sz w:val="20"/>
-                <w:szCs w:val="20"/>
+            <w:tcW w:w="1700" w:type="dxa"/>
+            <w:vAlign w:val="top"/>
+          </w:tcPr>
+          <w:p>
+            <w:pPr>
+              <w:spacing w:before="0" w:after="30" w:line="230" w:lineRule="auto"/>
+            </w:pPr>
+            <w:r>
+              <w:rPr>
+                <w:rFonts w:ascii="Calibri" w:hAnsi="Calibri" w:eastAsia="Calibri" w:cs="Calibri"/>
+                <w:sz w:val="18"/>
+                <w:szCs w:val="18"/>
               </w:rPr>
               <w:t>Persona2</w:t>
             </w:r>
@@ -1671,18 +2144,18 @@
         </w:tc>
         <w:tc>
           <w:tcPr>
-            <w:tcW w:w="2834" w:type="dxa"/>
-            <w:vAlign w:val="top"/>
-          </w:tcPr>
-          <w:p>
-            <w:pPr>
-              <w:spacing w:before="0" w:after="100" w:line="276" w:lineRule="auto"/>
-            </w:pPr>
-            <w:r>
-              <w:rPr>
-                <w:rFonts w:ascii="Calibri" w:hAnsi="Calibri" w:eastAsia="Calibri" w:cs="Calibri"/>
-                <w:sz w:val="20"/>
-                <w:szCs w:val="20"/>
+            <w:tcW w:w="1700" w:type="dxa"/>
+            <w:vAlign w:val="top"/>
+          </w:tcPr>
+          <w:p>
+            <w:pPr>
+              <w:spacing w:before="0" w:after="30" w:line="230" w:lineRule="auto"/>
+            </w:pPr>
+            <w:r>
+              <w:rPr>
+                <w:rFonts w:ascii="Calibri" w:hAnsi="Calibri" w:eastAsia="Calibri" w:cs="Calibri"/>
+                <w:sz w:val="18"/>
+                <w:szCs w:val="18"/>
               </w:rPr>
               <w:t>B2</w:t>
             </w:r>
@@ -1690,20 +2163,58 @@
         </w:tc>
         <w:tc>
           <w:tcPr>
-            <w:tcW w:w="2836" w:type="dxa"/>
-            <w:vAlign w:val="top"/>
-          </w:tcPr>
-          <w:p>
-            <w:pPr>
-              <w:spacing w:before="0" w:after="100" w:line="276" w:lineRule="auto"/>
-            </w:pPr>
-            <w:r>
-              <w:rPr>
-                <w:rFonts w:ascii="Calibri" w:hAnsi="Calibri" w:eastAsia="Calibri" w:cs="Calibri"/>
-                <w:sz w:val="20"/>
-                <w:szCs w:val="20"/>
+            <w:tcW w:w="1700" w:type="dxa"/>
+            <w:vAlign w:val="top"/>
+          </w:tcPr>
+          <w:p>
+            <w:pPr>
+              <w:spacing w:before="0" w:after="30" w:line="230" w:lineRule="auto"/>
+            </w:pPr>
+            <w:r>
+              <w:rPr>
+                <w:rFonts w:ascii="Calibri" w:hAnsi="Calibri" w:eastAsia="Calibri" w:cs="Calibri"/>
+                <w:sz w:val="18"/>
+                <w:szCs w:val="18"/>
               </w:rPr>
               <w:t>82</w:t>
+            </w:r>
+          </w:p>
+        </w:tc>
+        <w:tc>
+          <w:tcPr>
+            <w:tcW w:w="1700" w:type="dxa"/>
+            <w:vAlign w:val="top"/>
+          </w:tcPr>
+          <w:p>
+            <w:pPr>
+              <w:spacing w:before="0" w:after="30" w:line="230" w:lineRule="auto"/>
+            </w:pPr>
+            <w:r>
+              <w:rPr>
+                <w:rFonts w:ascii="Calibri" w:hAnsi="Calibri" w:eastAsia="Calibri" w:cs="Calibri"/>
+                <w:sz w:val="18"/>
+                <w:szCs w:val="18"/>
+              </w:rPr>
+              <w:t>33–38 s</w:t>
+            </w:r>
+          </w:p>
+        </w:tc>
+        <w:tc>
+          <w:tcPr>
+            <w:tcW w:w="1704" w:type="dxa"/>
+            <w:vAlign w:val="top"/>
+          </w:tcPr>
+          <w:p>
+            <w:pPr>
+              <w:spacing w:before="0" w:after="30" w:line="230" w:lineRule="auto"/>
+            </w:pPr>
+            <w:r>
+              <w:rPr>
+                <w:rFonts w:ascii="Calibri" w:hAnsi="Calibri" w:eastAsia="Calibri" w:cs="Calibri"/>
+                <w:sz w:val="18"/>
+                <w:szCs w:val="18"/>
+              </w:rPr>
+              <w:t>60 s</w:t>
             </w:r>
           </w:p>
         </w:tc>
@@ -1711,18 +2222,18 @@
       <w:tr>
         <w:tc>
           <w:tcPr>
-            <w:tcW w:w="2834" w:type="dxa"/>
-            <w:vAlign w:val="top"/>
-          </w:tcPr>
-          <w:p>
-            <w:pPr>
-              <w:spacing w:before="0" w:after="100" w:line="276" w:lineRule="auto"/>
-            </w:pPr>
-            <w:r>
-              <w:rPr>
-                <w:rFonts w:ascii="Calibri" w:hAnsi="Calibri" w:eastAsia="Calibri" w:cs="Calibri"/>
-                <w:sz w:val="20"/>
-                <w:szCs w:val="20"/>
+            <w:tcW w:w="1700" w:type="dxa"/>
+            <w:vAlign w:val="top"/>
+          </w:tcPr>
+          <w:p>
+            <w:pPr>
+              <w:spacing w:before="0" w:after="30" w:line="230" w:lineRule="auto"/>
+            </w:pPr>
+            <w:r>
+              <w:rPr>
+                <w:rFonts w:ascii="Calibri" w:hAnsi="Calibri" w:eastAsia="Calibri" w:cs="Calibri"/>
+                <w:sz w:val="18"/>
+                <w:szCs w:val="18"/>
               </w:rPr>
               <w:t>Persona3</w:t>
             </w:r>
@@ -1730,18 +2241,18 @@
         </w:tc>
         <w:tc>
           <w:tcPr>
-            <w:tcW w:w="2834" w:type="dxa"/>
-            <w:vAlign w:val="top"/>
-          </w:tcPr>
-          <w:p>
-            <w:pPr>
-              <w:spacing w:before="0" w:after="100" w:line="276" w:lineRule="auto"/>
-            </w:pPr>
-            <w:r>
-              <w:rPr>
-                <w:rFonts w:ascii="Calibri" w:hAnsi="Calibri" w:eastAsia="Calibri" w:cs="Calibri"/>
-                <w:sz w:val="20"/>
-                <w:szCs w:val="20"/>
+            <w:tcW w:w="1700" w:type="dxa"/>
+            <w:vAlign w:val="top"/>
+          </w:tcPr>
+          <w:p>
+            <w:pPr>
+              <w:spacing w:before="0" w:after="30" w:line="230" w:lineRule="auto"/>
+            </w:pPr>
+            <w:r>
+              <w:rPr>
+                <w:rFonts w:ascii="Calibri" w:hAnsi="Calibri" w:eastAsia="Calibri" w:cs="Calibri"/>
+                <w:sz w:val="18"/>
+                <w:szCs w:val="18"/>
               </w:rPr>
               <w:t>B3</w:t>
             </w:r>
@@ -1749,20 +2260,58 @@
         </w:tc>
         <w:tc>
           <w:tcPr>
-            <w:tcW w:w="2836" w:type="dxa"/>
-            <w:vAlign w:val="top"/>
-          </w:tcPr>
-          <w:p>
-            <w:pPr>
-              <w:spacing w:before="0" w:after="100" w:line="276" w:lineRule="auto"/>
-            </w:pPr>
-            <w:r>
-              <w:rPr>
-                <w:rFonts w:ascii="Calibri" w:hAnsi="Calibri" w:eastAsia="Calibri" w:cs="Calibri"/>
-                <w:sz w:val="20"/>
-                <w:szCs w:val="20"/>
+            <w:tcW w:w="1700" w:type="dxa"/>
+            <w:vAlign w:val="top"/>
+          </w:tcPr>
+          <w:p>
+            <w:pPr>
+              <w:spacing w:before="0" w:after="30" w:line="230" w:lineRule="auto"/>
+            </w:pPr>
+            <w:r>
+              <w:rPr>
+                <w:rFonts w:ascii="Calibri" w:hAnsi="Calibri" w:eastAsia="Calibri" w:cs="Calibri"/>
+                <w:sz w:val="18"/>
+                <w:szCs w:val="18"/>
               </w:rPr>
               <w:t>78</w:t>
+            </w:r>
+          </w:p>
+        </w:tc>
+        <w:tc>
+          <w:tcPr>
+            <w:tcW w:w="1700" w:type="dxa"/>
+            <w:vAlign w:val="top"/>
+          </w:tcPr>
+          <w:p>
+            <w:pPr>
+              <w:spacing w:before="0" w:after="30" w:line="230" w:lineRule="auto"/>
+            </w:pPr>
+            <w:r>
+              <w:rPr>
+                <w:rFonts w:ascii="Calibri" w:hAnsi="Calibri" w:eastAsia="Calibri" w:cs="Calibri"/>
+                <w:sz w:val="18"/>
+                <w:szCs w:val="18"/>
+              </w:rPr>
+              <w:t>31–36 s</w:t>
+            </w:r>
+          </w:p>
+        </w:tc>
+        <w:tc>
+          <w:tcPr>
+            <w:tcW w:w="1704" w:type="dxa"/>
+            <w:vAlign w:val="top"/>
+          </w:tcPr>
+          <w:p>
+            <w:pPr>
+              <w:spacing w:before="0" w:after="30" w:line="230" w:lineRule="auto"/>
+            </w:pPr>
+            <w:r>
+              <w:rPr>
+                <w:rFonts w:ascii="Calibri" w:hAnsi="Calibri" w:eastAsia="Calibri" w:cs="Calibri"/>
+                <w:sz w:val="18"/>
+                <w:szCs w:val="18"/>
+              </w:rPr>
+              <w:t>60 s</w:t>
             </w:r>
           </w:p>
         </w:tc>
@@ -1770,18 +2319,18 @@
       <w:tr>
         <w:tc>
           <w:tcPr>
-            <w:tcW w:w="2834" w:type="dxa"/>
-            <w:vAlign w:val="top"/>
-          </w:tcPr>
-          <w:p>
-            <w:pPr>
-              <w:spacing w:before="0" w:after="100" w:line="276" w:lineRule="auto"/>
-            </w:pPr>
-            <w:r>
-              <w:rPr>
-                <w:rFonts w:ascii="Calibri" w:hAnsi="Calibri" w:eastAsia="Calibri" w:cs="Calibri"/>
-                <w:sz w:val="20"/>
-                <w:szCs w:val="20"/>
+            <w:tcW w:w="1700" w:type="dxa"/>
+            <w:vAlign w:val="top"/>
+          </w:tcPr>
+          <w:p>
+            <w:pPr>
+              <w:spacing w:before="0" w:after="30" w:line="230" w:lineRule="auto"/>
+            </w:pPr>
+            <w:r>
+              <w:rPr>
+                <w:rFonts w:ascii="Calibri" w:hAnsi="Calibri" w:eastAsia="Calibri" w:cs="Calibri"/>
+                <w:sz w:val="18"/>
+                <w:szCs w:val="18"/>
               </w:rPr>
               <w:t>Persona4</w:t>
             </w:r>
@@ -1789,18 +2338,18 @@
         </w:tc>
         <w:tc>
           <w:tcPr>
-            <w:tcW w:w="2834" w:type="dxa"/>
-            <w:vAlign w:val="top"/>
-          </w:tcPr>
-          <w:p>
-            <w:pPr>
-              <w:spacing w:before="0" w:after="100" w:line="276" w:lineRule="auto"/>
-            </w:pPr>
-            <w:r>
-              <w:rPr>
-                <w:rFonts w:ascii="Calibri" w:hAnsi="Calibri" w:eastAsia="Calibri" w:cs="Calibri"/>
-                <w:sz w:val="20"/>
-                <w:szCs w:val="20"/>
+            <w:tcW w:w="1700" w:type="dxa"/>
+            <w:vAlign w:val="top"/>
+          </w:tcPr>
+          <w:p>
+            <w:pPr>
+              <w:spacing w:before="0" w:after="30" w:line="230" w:lineRule="auto"/>
+            </w:pPr>
+            <w:r>
+              <w:rPr>
+                <w:rFonts w:ascii="Calibri" w:hAnsi="Calibri" w:eastAsia="Calibri" w:cs="Calibri"/>
+                <w:sz w:val="18"/>
+                <w:szCs w:val="18"/>
               </w:rPr>
               <w:t>B4</w:t>
             </w:r>
@@ -1808,20 +2357,58 @@
         </w:tc>
         <w:tc>
           <w:tcPr>
-            <w:tcW w:w="2836" w:type="dxa"/>
-            <w:vAlign w:val="top"/>
-          </w:tcPr>
-          <w:p>
-            <w:pPr>
-              <w:spacing w:before="0" w:after="100" w:line="276" w:lineRule="auto"/>
-            </w:pPr>
-            <w:r>
-              <w:rPr>
-                <w:rFonts w:ascii="Calibri" w:hAnsi="Calibri" w:eastAsia="Calibri" w:cs="Calibri"/>
-                <w:sz w:val="20"/>
-                <w:szCs w:val="20"/>
+            <w:tcW w:w="1700" w:type="dxa"/>
+            <w:vAlign w:val="top"/>
+          </w:tcPr>
+          <w:p>
+            <w:pPr>
+              <w:spacing w:before="0" w:after="30" w:line="230" w:lineRule="auto"/>
+            </w:pPr>
+            <w:r>
+              <w:rPr>
+                <w:rFonts w:ascii="Calibri" w:hAnsi="Calibri" w:eastAsia="Calibri" w:cs="Calibri"/>
+                <w:sz w:val="18"/>
+                <w:szCs w:val="18"/>
               </w:rPr>
               <w:t>77</w:t>
+            </w:r>
+          </w:p>
+        </w:tc>
+        <w:tc>
+          <w:tcPr>
+            <w:tcW w:w="1700" w:type="dxa"/>
+            <w:vAlign w:val="top"/>
+          </w:tcPr>
+          <w:p>
+            <w:pPr>
+              <w:spacing w:before="0" w:after="30" w:line="230" w:lineRule="auto"/>
+            </w:pPr>
+            <w:r>
+              <w:rPr>
+                <w:rFonts w:ascii="Calibri" w:hAnsi="Calibri" w:eastAsia="Calibri" w:cs="Calibri"/>
+                <w:sz w:val="18"/>
+                <w:szCs w:val="18"/>
+              </w:rPr>
+              <w:t>31–36 s</w:t>
+            </w:r>
+          </w:p>
+        </w:tc>
+        <w:tc>
+          <w:tcPr>
+            <w:tcW w:w="1704" w:type="dxa"/>
+            <w:vAlign w:val="top"/>
+          </w:tcPr>
+          <w:p>
+            <w:pPr>
+              <w:spacing w:before="0" w:after="30" w:line="230" w:lineRule="auto"/>
+            </w:pPr>
+            <w:r>
+              <w:rPr>
+                <w:rFonts w:ascii="Calibri" w:hAnsi="Calibri" w:eastAsia="Calibri" w:cs="Calibri"/>
+                <w:sz w:val="18"/>
+                <w:szCs w:val="18"/>
+              </w:rPr>
+              <w:t>60 s</w:t>
             </w:r>
           </w:p>
         </w:tc>
@@ -1829,18 +2416,18 @@
       <w:tr>
         <w:tc>
           <w:tcPr>
-            <w:tcW w:w="2834" w:type="dxa"/>
-            <w:vAlign w:val="top"/>
-          </w:tcPr>
-          <w:p>
-            <w:pPr>
-              <w:spacing w:before="0" w:after="100" w:line="276" w:lineRule="auto"/>
-            </w:pPr>
-            <w:r>
-              <w:rPr>
-                <w:rFonts w:ascii="Calibri" w:hAnsi="Calibri" w:eastAsia="Calibri" w:cs="Calibri"/>
-                <w:sz w:val="20"/>
-                <w:szCs w:val="20"/>
+            <w:tcW w:w="1700" w:type="dxa"/>
+            <w:vAlign w:val="top"/>
+          </w:tcPr>
+          <w:p>
+            <w:pPr>
+              <w:spacing w:before="0" w:after="30" w:line="230" w:lineRule="auto"/>
+            </w:pPr>
+            <w:r>
+              <w:rPr>
+                <w:rFonts w:ascii="Calibri" w:hAnsi="Calibri" w:eastAsia="Calibri" w:cs="Calibri"/>
+                <w:sz w:val="18"/>
+                <w:szCs w:val="18"/>
               </w:rPr>
               <w:t>Persona5</w:t>
             </w:r>
@@ -1848,18 +2435,18 @@
         </w:tc>
         <w:tc>
           <w:tcPr>
-            <w:tcW w:w="2834" w:type="dxa"/>
-            <w:vAlign w:val="top"/>
-          </w:tcPr>
-          <w:p>
-            <w:pPr>
-              <w:spacing w:before="0" w:after="100" w:line="276" w:lineRule="auto"/>
-            </w:pPr>
-            <w:r>
-              <w:rPr>
-                <w:rFonts w:ascii="Calibri" w:hAnsi="Calibri" w:eastAsia="Calibri" w:cs="Calibri"/>
-                <w:sz w:val="20"/>
-                <w:szCs w:val="20"/>
+            <w:tcW w:w="1700" w:type="dxa"/>
+            <w:vAlign w:val="top"/>
+          </w:tcPr>
+          <w:p>
+            <w:pPr>
+              <w:spacing w:before="0" w:after="30" w:line="230" w:lineRule="auto"/>
+            </w:pPr>
+            <w:r>
+              <w:rPr>
+                <w:rFonts w:ascii="Calibri" w:hAnsi="Calibri" w:eastAsia="Calibri" w:cs="Calibri"/>
+                <w:sz w:val="18"/>
+                <w:szCs w:val="18"/>
               </w:rPr>
               <w:t>B5</w:t>
             </w:r>
@@ -1867,20 +2454,58 @@
         </w:tc>
         <w:tc>
           <w:tcPr>
-            <w:tcW w:w="2836" w:type="dxa"/>
-            <w:vAlign w:val="top"/>
-          </w:tcPr>
-          <w:p>
-            <w:pPr>
-              <w:spacing w:before="0" w:after="100" w:line="276" w:lineRule="auto"/>
-            </w:pPr>
-            <w:r>
-              <w:rPr>
-                <w:rFonts w:ascii="Calibri" w:hAnsi="Calibri" w:eastAsia="Calibri" w:cs="Calibri"/>
-                <w:sz w:val="20"/>
-                <w:szCs w:val="20"/>
-              </w:rPr>
-              <w:t>79</w:t>
+            <w:tcW w:w="1700" w:type="dxa"/>
+            <w:vAlign w:val="top"/>
+          </w:tcPr>
+          <w:p>
+            <w:pPr>
+              <w:spacing w:before="0" w:after="30" w:line="230" w:lineRule="auto"/>
+            </w:pPr>
+            <w:r>
+              <w:rPr>
+                <w:rFonts w:ascii="Calibri" w:hAnsi="Calibri" w:eastAsia="Calibri" w:cs="Calibri"/>
+                <w:sz w:val="18"/>
+                <w:szCs w:val="18"/>
+              </w:rPr>
+              <w:t>78</w:t>
+            </w:r>
+          </w:p>
+        </w:tc>
+        <w:tc>
+          <w:tcPr>
+            <w:tcW w:w="1700" w:type="dxa"/>
+            <w:vAlign w:val="top"/>
+          </w:tcPr>
+          <w:p>
+            <w:pPr>
+              <w:spacing w:before="0" w:after="30" w:line="230" w:lineRule="auto"/>
+            </w:pPr>
+            <w:r>
+              <w:rPr>
+                <w:rFonts w:ascii="Calibri" w:hAnsi="Calibri" w:eastAsia="Calibri" w:cs="Calibri"/>
+                <w:sz w:val="18"/>
+                <w:szCs w:val="18"/>
+              </w:rPr>
+              <w:t>31–36 s</w:t>
+            </w:r>
+          </w:p>
+        </w:tc>
+        <w:tc>
+          <w:tcPr>
+            <w:tcW w:w="1704" w:type="dxa"/>
+            <w:vAlign w:val="top"/>
+          </w:tcPr>
+          <w:p>
+            <w:pPr>
+              <w:spacing w:before="0" w:after="30" w:line="230" w:lineRule="auto"/>
+            </w:pPr>
+            <w:r>
+              <w:rPr>
+                <w:rFonts w:ascii="Calibri" w:hAnsi="Calibri" w:eastAsia="Calibri" w:cs="Calibri"/>
+                <w:sz w:val="18"/>
+                <w:szCs w:val="18"/>
+              </w:rPr>
+              <w:t>60 s</w:t>
             </w:r>
           </w:p>
         </w:tc>
@@ -1888,18 +2513,18 @@
       <w:tr>
         <w:tc>
           <w:tcPr>
-            <w:tcW w:w="2834" w:type="dxa"/>
-            <w:vAlign w:val="top"/>
-          </w:tcPr>
-          <w:p>
-            <w:pPr>
-              <w:spacing w:before="0" w:after="100" w:line="276" w:lineRule="auto"/>
-            </w:pPr>
-            <w:r>
-              <w:rPr>
-                <w:rFonts w:ascii="Calibri" w:hAnsi="Calibri" w:eastAsia="Calibri" w:cs="Calibri"/>
-                <w:sz w:val="20"/>
-                <w:szCs w:val="20"/>
+            <w:tcW w:w="1700" w:type="dxa"/>
+            <w:vAlign w:val="top"/>
+          </w:tcPr>
+          <w:p>
+            <w:pPr>
+              <w:spacing w:before="0" w:after="30" w:line="230" w:lineRule="auto"/>
+            </w:pPr>
+            <w:r>
+              <w:rPr>
+                <w:rFonts w:ascii="Calibri" w:hAnsi="Calibri" w:eastAsia="Calibri" w:cs="Calibri"/>
+                <w:sz w:val="18"/>
+                <w:szCs w:val="18"/>
                 <w:b/>
                 <w:bCs/>
               </w:rPr>
@@ -1909,18 +2534,18 @@
         </w:tc>
         <w:tc>
           <w:tcPr>
-            <w:tcW w:w="2834" w:type="dxa"/>
-            <w:vAlign w:val="top"/>
-          </w:tcPr>
-          <w:p>
-            <w:pPr>
-              <w:spacing w:before="0" w:after="100" w:line="276" w:lineRule="auto"/>
-            </w:pPr>
-            <w:r>
-              <w:rPr>
-                <w:rFonts w:ascii="Calibri" w:hAnsi="Calibri" w:eastAsia="Calibri" w:cs="Calibri"/>
-                <w:sz w:val="20"/>
-                <w:szCs w:val="20"/>
+            <w:tcW w:w="1700" w:type="dxa"/>
+            <w:vAlign w:val="top"/>
+          </w:tcPr>
+          <w:p>
+            <w:pPr>
+              <w:spacing w:before="0" w:after="30" w:line="230" w:lineRule="auto"/>
+            </w:pPr>
+            <w:r>
+              <w:rPr>
+                <w:rFonts w:ascii="Calibri" w:hAnsi="Calibri" w:eastAsia="Calibri" w:cs="Calibri"/>
+                <w:sz w:val="18"/>
+                <w:szCs w:val="18"/>
                 <w:b/>
                 <w:bCs/>
               </w:rPr>
@@ -1930,22 +2555,64 @@
         </w:tc>
         <w:tc>
           <w:tcPr>
-            <w:tcW w:w="2836" w:type="dxa"/>
-            <w:vAlign w:val="top"/>
-          </w:tcPr>
-          <w:p>
-            <w:pPr>
-              <w:spacing w:before="0" w:after="100" w:line="276" w:lineRule="auto"/>
-            </w:pPr>
-            <w:r>
-              <w:rPr>
-                <w:rFonts w:ascii="Calibri" w:hAnsi="Calibri" w:eastAsia="Calibri" w:cs="Calibri"/>
-                <w:sz w:val="20"/>
-                <w:szCs w:val="20"/>
+            <w:tcW w:w="1700" w:type="dxa"/>
+            <w:vAlign w:val="top"/>
+          </w:tcPr>
+          <w:p>
+            <w:pPr>
+              <w:spacing w:before="0" w:after="30" w:line="230" w:lineRule="auto"/>
+            </w:pPr>
+            <w:r>
+              <w:rPr>
+                <w:rFonts w:ascii="Calibri" w:hAnsi="Calibri" w:eastAsia="Calibri" w:cs="Calibri"/>
+                <w:sz w:val="18"/>
+                <w:szCs w:val="18"/>
                 <w:b/>
                 <w:bCs/>
               </w:rPr>
-              <w:t>400 (objetivo 380–420)</w:t>
+              <w:t>401</w:t>
+            </w:r>
+          </w:p>
+        </w:tc>
+        <w:tc>
+          <w:tcPr>
+            <w:tcW w:w="1700" w:type="dxa"/>
+            <w:vAlign w:val="top"/>
+          </w:tcPr>
+          <w:p>
+            <w:pPr>
+              <w:spacing w:before="0" w:after="30" w:line="230" w:lineRule="auto"/>
+            </w:pPr>
+            <w:r>
+              <w:rPr>
+                <w:rFonts w:ascii="Calibri" w:hAnsi="Calibri" w:eastAsia="Calibri" w:cs="Calibri"/>
+                <w:sz w:val="18"/>
+                <w:szCs w:val="18"/>
+                <w:b/>
+                <w:bCs/>
+              </w:rPr>
+              <w:t>160–185 s</w:t>
+            </w:r>
+          </w:p>
+        </w:tc>
+        <w:tc>
+          <w:tcPr>
+            <w:tcW w:w="1704" w:type="dxa"/>
+            <w:vAlign w:val="top"/>
+          </w:tcPr>
+          <w:p>
+            <w:pPr>
+              <w:spacing w:before="0" w:after="30" w:line="230" w:lineRule="auto"/>
+            </w:pPr>
+            <w:r>
+              <w:rPr>
+                <w:rFonts w:ascii="Calibri" w:hAnsi="Calibri" w:eastAsia="Calibri" w:cs="Calibri"/>
+                <w:sz w:val="18"/>
+                <w:szCs w:val="18"/>
+                <w:b/>
+                <w:bCs/>
+              </w:rPr>
+              <w:t>300 s</w:t>
             </w:r>
           </w:p>
         </w:tc>
@@ -1953,6 +2620,19 @@
     </w:tbl>
     <w:p>
       <w:pPr>
+        <w:spacing w:before="0" w:after="100" w:line="276" w:lineRule="auto"/>
+      </w:pPr>
+      <w:r>
+        <w:rPr>
+          <w:rFonts w:ascii="Calibri" w:hAnsi="Calibri" w:eastAsia="Calibri" w:cs="Calibri"/>
+          <w:sz w:val="22"/>
+          <w:szCs w:val="22"/>
+        </w:rPr>
+        <w:t>Cada voz cabe en su ventana de 54 s (B5: 50,5 s). La diferencia con los 60 s del clip son pausas para que las cifras queden legibles; no se agrega texto para llenarlas.</w:t>
+      </w:r>
+    </w:p>
+    <w:p>
+      <w:pPr>
         <w:spacing w:before="170" w:after="120"/>
         <w:keepNext/>
       </w:pPr>
@@ -1964,35 +2644,6 @@
           <w:b/>
           <w:bCs/>
         </w:rPr>
-        <w:t>Adaptación opcional para cuatro personas</w:t>
-      </w:r>
-    </w:p>
-    <w:p>
-      <w:pPr>
-        <w:spacing w:before="0" w:after="100" w:line="276" w:lineRule="auto"/>
-      </w:pPr>
-      <w:r>
-        <w:rPr>
-          <w:rFonts w:ascii="Calibri" w:hAnsi="Calibri" w:eastAsia="Calibri" w:cs="Calibri"/>
-          <w:sz w:val="22"/>
-          <w:szCs w:val="22"/>
-        </w:rPr>
-        <w:t>No es la distribución principal y no cambia ni duplica texto: Persona1 presenta B1 y B5; Persona2 presenta B2; Persona3, B3; Persona4, B4. Cada clip conserva su propia entrada y cierre, aunque una misma voz reaparezca.</w:t>
-      </w:r>
-    </w:p>
-    <w:p>
-      <w:pPr>
-        <w:spacing w:before="170" w:after="120"/>
-        <w:keepNext/>
-      </w:pPr>
-      <w:r>
-        <w:rPr>
-          <w:rFonts w:ascii="Calibri" w:hAnsi="Calibri" w:eastAsia="Calibri" w:cs="Calibri"/>
-          <w:sz w:val="28"/>
-          <w:szCs w:val="28"/>
-          <w:b/>
-          <w:bCs/>
-        </w:rPr>
         <w:t>Límites de afirmación</w:t>
       </w:r>
     </w:p>
@@ -2015,7 +2666,25 @@
           <w:sz w:val="22"/>
           <w:szCs w:val="22"/>
         </w:rPr>
-        <w:t>«Aceptación» es el registro del flujo de demostración, no una aprobación real de Cliente Alfa.</w:t>
+        <w:t xml:space="preserve">La solicitud queda </w:t>
+      </w:r>
+      <w:r>
+        <w:rPr>
+          <w:rFonts w:ascii="Calibri" w:hAnsi="Calibri" w:eastAsia="Calibri" w:cs="Calibri"/>
+          <w:sz w:val="22"/>
+          <w:szCs w:val="22"/>
+          <w:b/>
+          <w:bCs/>
+        </w:rPr>
+        <w:t>registrada</w:t>
+      </w:r>
+      <w:r>
+        <w:rPr>
+          <w:rFonts w:ascii="Calibri" w:hAnsi="Calibri" w:eastAsia="Calibri" w:cs="Calibri"/>
+          <w:sz w:val="22"/>
+          <w:szCs w:val="22"/>
+        </w:rPr>
+        <w:t xml:space="preserve"> en el prototipo; la UI indica «No se notificó al equipo comercial.». Rodrigo la ve porque abre el Resumen, no porque le llegue un aviso.</w:t>
       </w:r>
     </w:p>
     <w:p>
@@ -2037,7 +2706,7 @@
           <w:sz w:val="22"/>
           <w:szCs w:val="22"/>
         </w:rPr>
-        <w:t>«Calidad verificada» refleja la casilla que marca el operario al completar el total; no hay sensor ni ensayo físico automatizado.</w:t>
+        <w:t>«Aceptación» es el registro del flujo de demostración, no una aprobación real de Cliente Alfa.</w:t>
       </w:r>
     </w:p>
     <w:p>
@@ -2059,7 +2728,7 @@
           <w:sz w:val="22"/>
           <w:szCs w:val="22"/>
         </w:rPr>
-        <w:t>«Registrada» describe persistencia local del aviso; no significa correo, WhatsApp ni otro envío externo.</w:t>
+        <w:t>«Calidad verificada» refleja la casilla que marca el operario al completar el total; no hay sensor ni ensayo físico automatizado.</w:t>
       </w:r>
     </w:p>
     <w:p>
@@ -2081,7 +2750,7 @@
           <w:sz w:val="22"/>
           <w:szCs w:val="22"/>
         </w:rPr>
-        <w:t>La UI es una propuesta visual; este guion no afirma aprobación de usuarios, cumplimiento legal/accesibilidad, rendimiento medido ni uso productivo.</w:t>
+        <w:t>«Registrada» describe que el aviso quedó guardado en el prototipo; no significa correo, WhatsApp ni otro envío externo.</w:t>
       </w:r>
     </w:p>
     <w:p>
@@ -2103,7 +2772,29 @@
           <w:sz w:val="22"/>
           <w:szCs w:val="22"/>
         </w:rPr>
-        <w:t>Los 290 s y los conteos son presupuesto editorial. Falta que el grupo lea en voz alta, ensaye con cronómetro, ajuste la edición y grabe el video real.</w:t>
+        <w:t>La UI es una propuesta visual; este guion no afirma aprobación de usuarios, cumplimiento legal/accesibilidad, rendimiento medido ni uso productivo.</w:t>
+      </w:r>
+    </w:p>
+    <w:p>
+      <w:pPr>
+        <w:spacing w:before="0" w:after="100" w:line="276" w:lineRule="auto"/>
+        <w:ind w:left="360" w:hanging="180"/>
+      </w:pPr>
+      <w:r>
+        <w:rPr>
+          <w:rFonts w:ascii="Calibri" w:hAnsi="Calibri" w:eastAsia="Calibri" w:cs="Calibri"/>
+          <w:sz w:val="22"/>
+          <w:szCs w:val="22"/>
+        </w:rPr>
+        <w:t xml:space="preserve">• </w:t>
+      </w:r>
+      <w:r>
+        <w:rPr>
+          <w:rFonts w:ascii="Calibri" w:hAnsi="Calibri" w:eastAsia="Calibri" w:cs="Calibri"/>
+          <w:sz w:val="22"/>
+          <w:szCs w:val="22"/>
+        </w:rPr>
+        <w:t>Los 60 s por clip y los 300 s totales son especificaciones de montaje; el tiempo de voz es una estimación. Falta que las cinco personas lean en voz alta, ensayen con cronómetro sobre los clips mudos y, si corresponde, graben su locución.</w:t>
       </w:r>
     </w:p>
     <w:sectPr>

</xml_diff>

<commit_message>
docs(video): sincronizar documentación con los seis MP4 entregados
Guion, storyboard, ensayo, guía, README y cierre apuntan al plan 5 x 60 s
y a los archivos de entregables/videos (5 x 60,000 s + continuo 300,000 s,
H.264 1080p 30 fps, sin audio). Locución humana y revisión completa siguen
pendientes. diseno-video-5min.md queda rotulado como histórico supersedido y
las secciones 1-6 del cierre como registro histórico (58 s/290 s/400).
Se regenera solo Guion de presentacion.docx desde su fuente (401 palabras).

Co-Authored-By: Claude Opus 5.5 <noreply@anthropic.com>
</commit_message>
<xml_diff>
--- a/entregables/Guion de presentacion.docx
+++ b/entregables/Guion de presentacion.docx
@@ -196,7 +196,93 @@
           <w:sz w:val="22"/>
           <w:szCs w:val="22"/>
         </w:rPr>
-        <w:t xml:space="preserve"> todavía no hay MP4, lectura humana ensayada ni locución grabada; las duraciones de voz son estimaciones, no mediciones.</w:t>
+        <w:t xml:space="preserve"> los seis MP4 mudos ya están entregados en </w:t>
+      </w:r>
+      <w:r>
+        <w:rPr>
+          <w:rFonts w:ascii="Calibri" w:hAnsi="Calibri" w:eastAsia="Calibri" w:cs="Calibri"/>
+          <w:sz w:val="22"/>
+          <w:szCs w:val="22"/>
+        </w:rPr>
+        <w:t>entregables/videos (../entregables/videos/)</w:t>
+      </w:r>
+      <w:r>
+        <w:rPr>
+          <w:rFonts w:ascii="Calibri" w:hAnsi="Calibri" w:eastAsia="Calibri" w:cs="Calibri"/>
+          <w:sz w:val="22"/>
+          <w:szCs w:val="22"/>
+        </w:rPr>
+        <w:t xml:space="preserve">: cinco clips de </w:t>
+      </w:r>
+      <w:r>
+        <w:rPr>
+          <w:rFonts w:ascii="Calibri" w:hAnsi="Calibri" w:eastAsia="Calibri" w:cs="Calibri"/>
+          <w:sz w:val="22"/>
+          <w:szCs w:val="22"/>
+          <w:b/>
+          <w:bCs/>
+        </w:rPr>
+        <w:t>60,000 s</w:t>
+      </w:r>
+      <w:r>
+        <w:rPr>
+          <w:rFonts w:ascii="Calibri" w:hAnsi="Calibri" w:eastAsia="Calibri" w:cs="Calibri"/>
+          <w:sz w:val="22"/>
+          <w:szCs w:val="22"/>
+        </w:rPr>
+        <w:t xml:space="preserve"> y un continuo de </w:t>
+      </w:r>
+      <w:r>
+        <w:rPr>
+          <w:rFonts w:ascii="Calibri" w:hAnsi="Calibri" w:eastAsia="Calibri" w:cs="Calibri"/>
+          <w:sz w:val="22"/>
+          <w:szCs w:val="22"/>
+          <w:b/>
+          <w:bCs/>
+        </w:rPr>
+        <w:t>300,000 s</w:t>
+      </w:r>
+      <w:r>
+        <w:rPr>
+          <w:rFonts w:ascii="Calibri" w:hAnsi="Calibri" w:eastAsia="Calibri" w:cs="Calibri"/>
+          <w:sz w:val="22"/>
+          <w:szCs w:val="22"/>
+        </w:rPr>
+        <w:t xml:space="preserve">, H.264 1920 × 1080 a 30 fps y </w:t>
+      </w:r>
+      <w:r>
+        <w:rPr>
+          <w:rFonts w:ascii="Calibri" w:hAnsi="Calibri" w:eastAsia="Calibri" w:cs="Calibri"/>
+          <w:sz w:val="22"/>
+          <w:szCs w:val="22"/>
+          <w:b/>
+          <w:bCs/>
+        </w:rPr>
+        <w:t>sin pista de audio</w:t>
+      </w:r>
+      <w:r>
+        <w:rPr>
+          <w:rFonts w:ascii="Calibri" w:hAnsi="Calibri" w:eastAsia="Calibri" w:cs="Calibri"/>
+          <w:sz w:val="22"/>
+          <w:szCs w:val="22"/>
+        </w:rPr>
+        <w:t xml:space="preserve"> (detalle en el </w:t>
+      </w:r>
+      <w:r>
+        <w:rPr>
+          <w:rFonts w:ascii="Calibri" w:hAnsi="Calibri" w:eastAsia="Calibri" w:cs="Calibri"/>
+          <w:sz w:val="22"/>
+          <w:szCs w:val="22"/>
+        </w:rPr>
+        <w:t>cierre (cierre-video.md)</w:t>
+      </w:r>
+      <w:r>
+        <w:rPr>
+          <w:rFonts w:ascii="Calibri" w:hAnsi="Calibri" w:eastAsia="Calibri" w:cs="Calibri"/>
+          <w:sz w:val="22"/>
+          <w:szCs w:val="22"/>
+        </w:rPr>
+        <w:t>). Siguen pendientes la locución humana de Persona1–Persona5 y la revisión completa a velocidad normal por el grupo; las duraciones de voz son estimaciones, no mediciones.</w:t>
       </w:r>
     </w:p>
     <w:p>
@@ -2794,7 +2880,7 @@
           <w:sz w:val="22"/>
           <w:szCs w:val="22"/>
         </w:rPr>
-        <w:t>Los 60 s por clip y los 300 s totales son especificaciones de montaje; el tiempo de voz es una estimación. Falta que las cinco personas lean en voz alta, ensayen con cronómetro sobre los clips mudos y, si corresponde, graben su locución.</w:t>
+        <w:t>Los 60 s por clip y los 300 s totales son las duraciones verificadas de los MP4 entregados; el tiempo de voz sigue siendo una estimación. Falta que las cinco personas lean en voz alta, ensayen con cronómetro sobre los clips mudos y, si corresponde, graben su locución.</w:t>
       </w:r>
     </w:p>
     <w:sectPr>

</xml_diff>